<commit_message>
pre cambios tutoria 5/5, incluye mailtrap
</commit_message>
<xml_diff>
--- a/docu/memoriaEstructura.docx
+++ b/docu/memoriaEstructura.docx
@@ -5,7 +5,7 @@
     <w:p>
       <w:pPr>
         <w:rPr>
-          <w:rFonts w:ascii="Aharoni" w:hAnsi="Aharoni" w:cs="Aharoni" w:hint="cs"/>
+          <w:rFonts w:ascii="Aharoni" w:hAnsi="Aharoni" w:cs="Aharoni"/>
           <w:color w:val="0F9ED5" w:themeColor="accent4"/>
           <w:sz w:val="52"/>
           <w:szCs w:val="52"/>
@@ -47,7 +47,7 @@
                     </pic:cNvPicPr>
                   </pic:nvPicPr>
                   <pic:blipFill>
-                    <a:blip r:embed="rId7">
+                    <a:blip r:embed="rId8">
                       <a:extLst>
                         <a:ext uri="{28A0092B-C50C-407E-A947-70E740481C1C}">
                           <a14:useLocalDpi xmlns:a14="http://schemas.microsoft.com/office/drawing/2010/main" val="0"/>
@@ -129,7 +129,7 @@
       <w:pPr>
         <w:pStyle w:val="Ttulo1"/>
       </w:pPr>
-      <w:bookmarkStart w:id="0" w:name="_Toc226472254"/>
+      <w:bookmarkStart w:id="0" w:name="_Toc228392844"/>
       <w:r>
         <w:lastRenderedPageBreak/>
         <w:t>Índice</w:t>
@@ -138,6 +138,15 @@
     </w:p>
     <w:sdt>
       <w:sdtPr>
+        <w:rPr>
+          <w:rFonts w:asciiTheme="minorHAnsi" w:eastAsiaTheme="minorHAnsi" w:hAnsiTheme="minorHAnsi" w:cstheme="minorBidi"/>
+          <w:color w:val="auto"/>
+          <w:kern w:val="2"/>
+          <w:sz w:val="24"/>
+          <w:szCs w:val="24"/>
+          <w:lang w:eastAsia="en-US"/>
+          <w14:ligatures w14:val="standardContextual"/>
+        </w:rPr>
         <w:id w:val="1833180325"/>
         <w:docPartObj>
           <w:docPartGallery w:val="Table of Contents"/>
@@ -146,15 +155,8 @@
       </w:sdtPr>
       <w:sdtEndPr>
         <w:rPr>
-          <w:rFonts w:asciiTheme="minorHAnsi" w:eastAsiaTheme="minorHAnsi" w:hAnsiTheme="minorHAnsi" w:cstheme="minorBidi"/>
           <w:b/>
           <w:bCs/>
-          <w:color w:val="auto"/>
-          <w:kern w:val="2"/>
-          <w:sz w:val="24"/>
-          <w:szCs w:val="24"/>
-          <w:lang w:eastAsia="en-US"/>
-          <w14:ligatures w14:val="standardContextual"/>
         </w:rPr>
       </w:sdtEndPr>
       <w:sdtContent>
@@ -187,7 +189,7 @@
           <w:r>
             <w:fldChar w:fldCharType="separate"/>
           </w:r>
-          <w:hyperlink w:anchor="_Toc226472254" w:history="1">
+          <w:hyperlink w:anchor="_Toc228392844" w:history="1">
             <w:r>
               <w:rPr>
                 <w:rStyle w:val="Hipervnculo"/>
@@ -214,7 +216,7 @@
                 <w:noProof/>
                 <w:webHidden/>
               </w:rPr>
-              <w:instrText xml:space="preserve"> PAGEREF _Toc226472254 \h </w:instrText>
+              <w:instrText xml:space="preserve"> PAGEREF _Toc228392844 \h </w:instrText>
             </w:r>
             <w:r>
               <w:rPr>
@@ -257,7 +259,7 @@
               <w:lang w:eastAsia="es-ES"/>
             </w:rPr>
           </w:pPr>
-          <w:hyperlink w:anchor="_Toc226472255" w:history="1">
+          <w:hyperlink w:anchor="_Toc228392845" w:history="1">
             <w:r>
               <w:rPr>
                 <w:rStyle w:val="Hipervnculo"/>
@@ -284,7 +286,7 @@
                 <w:noProof/>
                 <w:webHidden/>
               </w:rPr>
-              <w:instrText xml:space="preserve"> PAGEREF _Toc226472255 \h </w:instrText>
+              <w:instrText xml:space="preserve"> PAGEREF _Toc228392845 \h </w:instrText>
             </w:r>
             <w:r>
               <w:rPr>
@@ -304,7 +306,7 @@
                 <w:noProof/>
                 <w:webHidden/>
               </w:rPr>
-              <w:t>2</w:t>
+              <w:t>3</w:t>
             </w:r>
             <w:r>
               <w:rPr>
@@ -327,7 +329,7 @@
               <w:lang w:eastAsia="es-ES"/>
             </w:rPr>
           </w:pPr>
-          <w:hyperlink w:anchor="_Toc226472256" w:history="1">
+          <w:hyperlink w:anchor="_Toc228392846" w:history="1">
             <w:r>
               <w:rPr>
                 <w:rStyle w:val="Hipervnculo"/>
@@ -354,7 +356,7 @@
                 <w:noProof/>
                 <w:webHidden/>
               </w:rPr>
-              <w:instrText xml:space="preserve"> PAGEREF _Toc226472256 \h </w:instrText>
+              <w:instrText xml:space="preserve"> PAGEREF _Toc228392846 \h </w:instrText>
             </w:r>
             <w:r>
               <w:rPr>
@@ -374,7 +376,7 @@
                 <w:noProof/>
                 <w:webHidden/>
               </w:rPr>
-              <w:t>3</w:t>
+              <w:t>4</w:t>
             </w:r>
             <w:r>
               <w:rPr>
@@ -392,10 +394,12 @@
               <w:tab w:val="right" w:leader="dot" w:pos="8494"/>
             </w:tabs>
             <w:rPr>
+              <w:rFonts w:eastAsiaTheme="minorEastAsia"/>
               <w:noProof/>
+              <w:lang w:eastAsia="es-ES"/>
             </w:rPr>
           </w:pPr>
-          <w:hyperlink w:anchor="_Toc226472257" w:history="1">
+          <w:hyperlink w:anchor="_Toc228392847" w:history="1">
             <w:r>
               <w:rPr>
                 <w:rStyle w:val="Hipervnculo"/>
@@ -422,7 +426,7 @@
                 <w:noProof/>
                 <w:webHidden/>
               </w:rPr>
-              <w:instrText xml:space="preserve"> PAGEREF _Toc226472257 \h </w:instrText>
+              <w:instrText xml:space="preserve"> PAGEREF _Toc228392847 \h </w:instrText>
             </w:r>
             <w:r>
               <w:rPr>
@@ -442,7 +446,7 @@
                 <w:noProof/>
                 <w:webHidden/>
               </w:rPr>
-              <w:t>3</w:t>
+              <w:t>4</w:t>
             </w:r>
             <w:r>
               <w:rPr>
@@ -460,10 +464,12 @@
               <w:tab w:val="right" w:leader="dot" w:pos="8494"/>
             </w:tabs>
             <w:rPr>
+              <w:rFonts w:eastAsiaTheme="minorEastAsia"/>
               <w:noProof/>
+              <w:lang w:eastAsia="es-ES"/>
             </w:rPr>
           </w:pPr>
-          <w:hyperlink w:anchor="_Toc226472258" w:history="1">
+          <w:hyperlink w:anchor="_Toc228392848" w:history="1">
             <w:r>
               <w:rPr>
                 <w:rStyle w:val="Hipervnculo"/>
@@ -490,7 +496,7 @@
                 <w:noProof/>
                 <w:webHidden/>
               </w:rPr>
-              <w:instrText xml:space="preserve"> PAGEREF _Toc226472258 \h </w:instrText>
+              <w:instrText xml:space="preserve"> PAGEREF _Toc228392848 \h </w:instrText>
             </w:r>
             <w:r>
               <w:rPr>
@@ -510,7 +516,7 @@
                 <w:noProof/>
                 <w:webHidden/>
               </w:rPr>
-              <w:t>3</w:t>
+              <w:t>4</w:t>
             </w:r>
             <w:r>
               <w:rPr>
@@ -528,10 +534,12 @@
               <w:tab w:val="right" w:leader="dot" w:pos="8494"/>
             </w:tabs>
             <w:rPr>
+              <w:rFonts w:eastAsiaTheme="minorEastAsia"/>
               <w:noProof/>
+              <w:lang w:eastAsia="es-ES"/>
             </w:rPr>
           </w:pPr>
-          <w:hyperlink w:anchor="_Toc226472259" w:history="1">
+          <w:hyperlink w:anchor="_Toc228392849" w:history="1">
             <w:r>
               <w:rPr>
                 <w:rStyle w:val="Hipervnculo"/>
@@ -558,7 +566,7 @@
                 <w:noProof/>
                 <w:webHidden/>
               </w:rPr>
-              <w:instrText xml:space="preserve"> PAGEREF _Toc226472259 \h </w:instrText>
+              <w:instrText xml:space="preserve"> PAGEREF _Toc228392849 \h </w:instrText>
             </w:r>
             <w:r>
               <w:rPr>
@@ -578,7 +586,7 @@
                 <w:noProof/>
                 <w:webHidden/>
               </w:rPr>
-              <w:t>3</w:t>
+              <w:t>4</w:t>
             </w:r>
             <w:r>
               <w:rPr>
@@ -601,7 +609,7 @@
               <w:lang w:eastAsia="es-ES"/>
             </w:rPr>
           </w:pPr>
-          <w:hyperlink w:anchor="_Toc226472260" w:history="1">
+          <w:hyperlink w:anchor="_Toc228392850" w:history="1">
             <w:r>
               <w:rPr>
                 <w:rStyle w:val="Hipervnculo"/>
@@ -628,7 +636,7 @@
                 <w:noProof/>
                 <w:webHidden/>
               </w:rPr>
-              <w:instrText xml:space="preserve"> PAGEREF _Toc226472260 \h </w:instrText>
+              <w:instrText xml:space="preserve"> PAGEREF _Toc228392850 \h </w:instrText>
             </w:r>
             <w:r>
               <w:rPr>
@@ -648,7 +656,7 @@
                 <w:noProof/>
                 <w:webHidden/>
               </w:rPr>
-              <w:t>3</w:t>
+              <w:t>4</w:t>
             </w:r>
             <w:r>
               <w:rPr>
@@ -671,7 +679,7 @@
               <w:lang w:eastAsia="es-ES"/>
             </w:rPr>
           </w:pPr>
-          <w:hyperlink w:anchor="_Toc226472261" w:history="1">
+          <w:hyperlink w:anchor="_Toc228392851" w:history="1">
             <w:r>
               <w:rPr>
                 <w:rStyle w:val="Hipervnculo"/>
@@ -698,7 +706,7 @@
                 <w:noProof/>
                 <w:webHidden/>
               </w:rPr>
-              <w:instrText xml:space="preserve"> PAGEREF _Toc226472261 \h </w:instrText>
+              <w:instrText xml:space="preserve"> PAGEREF _Toc228392851 \h </w:instrText>
             </w:r>
             <w:r>
               <w:rPr>
@@ -718,7 +726,357 @@
                 <w:noProof/>
                 <w:webHidden/>
               </w:rPr>
-              <w:t>3</w:t>
+              <w:t>5</w:t>
+            </w:r>
+            <w:r>
+              <w:rPr>
+                <w:noProof/>
+                <w:webHidden/>
+              </w:rPr>
+              <w:fldChar w:fldCharType="end"/>
+            </w:r>
+          </w:hyperlink>
+        </w:p>
+        <w:p>
+          <w:pPr>
+            <w:pStyle w:val="TDC2"/>
+            <w:tabs>
+              <w:tab w:val="right" w:leader="dot" w:pos="8494"/>
+            </w:tabs>
+            <w:rPr>
+              <w:rFonts w:eastAsiaTheme="minorEastAsia"/>
+              <w:noProof/>
+              <w:lang w:eastAsia="es-ES"/>
+            </w:rPr>
+          </w:pPr>
+          <w:hyperlink w:anchor="_Toc228392852" w:history="1">
+            <w:r>
+              <w:rPr>
+                <w:rStyle w:val="Hipervnculo"/>
+                <w:noProof/>
+              </w:rPr>
+              <w:t>Vue.js</w:t>
+            </w:r>
+            <w:r>
+              <w:rPr>
+                <w:noProof/>
+                <w:webHidden/>
+              </w:rPr>
+              <w:tab/>
+            </w:r>
+            <w:r>
+              <w:rPr>
+                <w:noProof/>
+                <w:webHidden/>
+              </w:rPr>
+              <w:fldChar w:fldCharType="begin"/>
+            </w:r>
+            <w:r>
+              <w:rPr>
+                <w:noProof/>
+                <w:webHidden/>
+              </w:rPr>
+              <w:instrText xml:space="preserve"> PAGEREF _Toc228392852 \h </w:instrText>
+            </w:r>
+            <w:r>
+              <w:rPr>
+                <w:noProof/>
+                <w:webHidden/>
+              </w:rPr>
+            </w:r>
+            <w:r>
+              <w:rPr>
+                <w:noProof/>
+                <w:webHidden/>
+              </w:rPr>
+              <w:fldChar w:fldCharType="separate"/>
+            </w:r>
+            <w:r>
+              <w:rPr>
+                <w:noProof/>
+                <w:webHidden/>
+              </w:rPr>
+              <w:t>5</w:t>
+            </w:r>
+            <w:r>
+              <w:rPr>
+                <w:noProof/>
+                <w:webHidden/>
+              </w:rPr>
+              <w:fldChar w:fldCharType="end"/>
+            </w:r>
+          </w:hyperlink>
+        </w:p>
+        <w:p>
+          <w:pPr>
+            <w:pStyle w:val="TDC2"/>
+            <w:tabs>
+              <w:tab w:val="right" w:leader="dot" w:pos="8494"/>
+            </w:tabs>
+            <w:rPr>
+              <w:rFonts w:eastAsiaTheme="minorEastAsia"/>
+              <w:noProof/>
+              <w:lang w:eastAsia="es-ES"/>
+            </w:rPr>
+          </w:pPr>
+          <w:hyperlink w:anchor="_Toc228392853" w:history="1">
+            <w:r>
+              <w:rPr>
+                <w:rStyle w:val="Hipervnculo"/>
+                <w:noProof/>
+              </w:rPr>
+              <w:t>Django</w:t>
+            </w:r>
+            <w:r>
+              <w:rPr>
+                <w:noProof/>
+                <w:webHidden/>
+              </w:rPr>
+              <w:tab/>
+            </w:r>
+            <w:r>
+              <w:rPr>
+                <w:noProof/>
+                <w:webHidden/>
+              </w:rPr>
+              <w:fldChar w:fldCharType="begin"/>
+            </w:r>
+            <w:r>
+              <w:rPr>
+                <w:noProof/>
+                <w:webHidden/>
+              </w:rPr>
+              <w:instrText xml:space="preserve"> PAGEREF _Toc228392853 \h </w:instrText>
+            </w:r>
+            <w:r>
+              <w:rPr>
+                <w:noProof/>
+                <w:webHidden/>
+              </w:rPr>
+            </w:r>
+            <w:r>
+              <w:rPr>
+                <w:noProof/>
+                <w:webHidden/>
+              </w:rPr>
+              <w:fldChar w:fldCharType="separate"/>
+            </w:r>
+            <w:r>
+              <w:rPr>
+                <w:noProof/>
+                <w:webHidden/>
+              </w:rPr>
+              <w:t>5</w:t>
+            </w:r>
+            <w:r>
+              <w:rPr>
+                <w:noProof/>
+                <w:webHidden/>
+              </w:rPr>
+              <w:fldChar w:fldCharType="end"/>
+            </w:r>
+          </w:hyperlink>
+        </w:p>
+        <w:p>
+          <w:pPr>
+            <w:pStyle w:val="TDC2"/>
+            <w:tabs>
+              <w:tab w:val="right" w:leader="dot" w:pos="8494"/>
+            </w:tabs>
+            <w:rPr>
+              <w:rFonts w:eastAsiaTheme="minorEastAsia"/>
+              <w:noProof/>
+              <w:lang w:eastAsia="es-ES"/>
+            </w:rPr>
+          </w:pPr>
+          <w:hyperlink w:anchor="_Toc228392854" w:history="1">
+            <w:r>
+              <w:rPr>
+                <w:rStyle w:val="Hipervnculo"/>
+                <w:noProof/>
+              </w:rPr>
+              <w:t>PostgresSQL</w:t>
+            </w:r>
+            <w:r>
+              <w:rPr>
+                <w:noProof/>
+                <w:webHidden/>
+              </w:rPr>
+              <w:tab/>
+            </w:r>
+            <w:r>
+              <w:rPr>
+                <w:noProof/>
+                <w:webHidden/>
+              </w:rPr>
+              <w:fldChar w:fldCharType="begin"/>
+            </w:r>
+            <w:r>
+              <w:rPr>
+                <w:noProof/>
+                <w:webHidden/>
+              </w:rPr>
+              <w:instrText xml:space="preserve"> PAGEREF _Toc228392854 \h </w:instrText>
+            </w:r>
+            <w:r>
+              <w:rPr>
+                <w:noProof/>
+                <w:webHidden/>
+              </w:rPr>
+            </w:r>
+            <w:r>
+              <w:rPr>
+                <w:noProof/>
+                <w:webHidden/>
+              </w:rPr>
+              <w:fldChar w:fldCharType="separate"/>
+            </w:r>
+            <w:r>
+              <w:rPr>
+                <w:noProof/>
+                <w:webHidden/>
+              </w:rPr>
+              <w:t>5</w:t>
+            </w:r>
+            <w:r>
+              <w:rPr>
+                <w:noProof/>
+                <w:webHidden/>
+              </w:rPr>
+              <w:fldChar w:fldCharType="end"/>
+            </w:r>
+          </w:hyperlink>
+        </w:p>
+        <w:p>
+          <w:pPr>
+            <w:pStyle w:val="TDC2"/>
+            <w:tabs>
+              <w:tab w:val="right" w:leader="dot" w:pos="8494"/>
+            </w:tabs>
+            <w:rPr>
+              <w:rFonts w:eastAsiaTheme="minorEastAsia"/>
+              <w:noProof/>
+              <w:lang w:eastAsia="es-ES"/>
+            </w:rPr>
+          </w:pPr>
+          <w:hyperlink w:anchor="_Toc228392855" w:history="1">
+            <w:r>
+              <w:rPr>
+                <w:rStyle w:val="Hipervnculo"/>
+                <w:noProof/>
+              </w:rPr>
+              <w:t>Servicios externos:</w:t>
+            </w:r>
+            <w:r>
+              <w:rPr>
+                <w:noProof/>
+                <w:webHidden/>
+              </w:rPr>
+              <w:tab/>
+            </w:r>
+            <w:r>
+              <w:rPr>
+                <w:noProof/>
+                <w:webHidden/>
+              </w:rPr>
+              <w:fldChar w:fldCharType="begin"/>
+            </w:r>
+            <w:r>
+              <w:rPr>
+                <w:noProof/>
+                <w:webHidden/>
+              </w:rPr>
+              <w:instrText xml:space="preserve"> PAGEREF _Toc228392855 \h </w:instrText>
+            </w:r>
+            <w:r>
+              <w:rPr>
+                <w:noProof/>
+                <w:webHidden/>
+              </w:rPr>
+            </w:r>
+            <w:r>
+              <w:rPr>
+                <w:noProof/>
+                <w:webHidden/>
+              </w:rPr>
+              <w:fldChar w:fldCharType="separate"/>
+            </w:r>
+            <w:r>
+              <w:rPr>
+                <w:noProof/>
+                <w:webHidden/>
+              </w:rPr>
+              <w:t>5</w:t>
+            </w:r>
+            <w:r>
+              <w:rPr>
+                <w:noProof/>
+                <w:webHidden/>
+              </w:rPr>
+              <w:fldChar w:fldCharType="end"/>
+            </w:r>
+          </w:hyperlink>
+        </w:p>
+        <w:p>
+          <w:pPr>
+            <w:pStyle w:val="TDC3"/>
+            <w:tabs>
+              <w:tab w:val="right" w:leader="dot" w:pos="8494"/>
+            </w:tabs>
+            <w:rPr>
+              <w:rFonts w:eastAsiaTheme="minorEastAsia"/>
+              <w:noProof/>
+              <w:lang w:eastAsia="es-ES"/>
+            </w:rPr>
+          </w:pPr>
+          <w:hyperlink w:anchor="_Toc228392856" w:history="1">
+            <w:r>
+              <w:rPr>
+                <w:rStyle w:val="Hipervnculo"/>
+                <w:noProof/>
+              </w:rPr>
+              <w:t>Stripe</w:t>
+            </w:r>
+            <w:r>
+              <w:rPr>
+                <w:noProof/>
+                <w:webHidden/>
+              </w:rPr>
+              <w:tab/>
+            </w:r>
+            <w:r>
+              <w:rPr>
+                <w:noProof/>
+                <w:webHidden/>
+              </w:rPr>
+              <w:fldChar w:fldCharType="begin"/>
+            </w:r>
+            <w:r>
+              <w:rPr>
+                <w:noProof/>
+                <w:webHidden/>
+              </w:rPr>
+              <w:instrText xml:space="preserve"> PAGEREF _Toc228392856 \h </w:instrText>
+            </w:r>
+            <w:r>
+              <w:rPr>
+                <w:noProof/>
+                <w:webHidden/>
+              </w:rPr>
+            </w:r>
+            <w:r>
+              <w:rPr>
+                <w:noProof/>
+                <w:webHidden/>
+              </w:rPr>
+              <w:fldChar w:fldCharType="separate"/>
+            </w:r>
+            <w:r>
+              <w:rPr>
+                <w:noProof/>
+                <w:webHidden/>
+              </w:rPr>
+              <w:t>5</w:t>
             </w:r>
             <w:r>
               <w:rPr>
@@ -741,7 +1099,7 @@
               <w:lang w:eastAsia="es-ES"/>
             </w:rPr>
           </w:pPr>
-          <w:hyperlink w:anchor="_Toc226472262" w:history="1">
+          <w:hyperlink w:anchor="_Toc228392857" w:history="1">
             <w:r>
               <w:rPr>
                 <w:rStyle w:val="Hipervnculo"/>
@@ -768,7 +1126,7 @@
                 <w:noProof/>
                 <w:webHidden/>
               </w:rPr>
-              <w:instrText xml:space="preserve"> PAGEREF _Toc226472262 \h </w:instrText>
+              <w:instrText xml:space="preserve"> PAGEREF _Toc228392857 \h </w:instrText>
             </w:r>
             <w:r>
               <w:rPr>
@@ -788,7 +1146,7 @@
                 <w:noProof/>
                 <w:webHidden/>
               </w:rPr>
-              <w:t>3</w:t>
+              <w:t>6</w:t>
             </w:r>
             <w:r>
               <w:rPr>
@@ -806,10 +1164,12 @@
               <w:tab w:val="right" w:leader="dot" w:pos="8494"/>
             </w:tabs>
             <w:rPr>
+              <w:rFonts w:eastAsiaTheme="minorEastAsia"/>
               <w:noProof/>
+              <w:lang w:eastAsia="es-ES"/>
             </w:rPr>
           </w:pPr>
-          <w:hyperlink w:anchor="_Toc226472263" w:history="1">
+          <w:hyperlink w:anchor="_Toc228392858" w:history="1">
             <w:r>
               <w:rPr>
                 <w:rStyle w:val="Hipervnculo"/>
@@ -836,7 +1196,7 @@
                 <w:noProof/>
                 <w:webHidden/>
               </w:rPr>
-              <w:instrText xml:space="preserve"> PAGEREF _Toc226472263 \h </w:instrText>
+              <w:instrText xml:space="preserve"> PAGEREF _Toc228392858 \h </w:instrText>
             </w:r>
             <w:r>
               <w:rPr>
@@ -856,7 +1216,7 @@
                 <w:noProof/>
                 <w:webHidden/>
               </w:rPr>
-              <w:t>3</w:t>
+              <w:t>6</w:t>
             </w:r>
             <w:r>
               <w:rPr>
@@ -874,10 +1234,12 @@
               <w:tab w:val="right" w:leader="dot" w:pos="8494"/>
             </w:tabs>
             <w:rPr>
+              <w:rFonts w:eastAsiaTheme="minorEastAsia"/>
               <w:noProof/>
+              <w:lang w:eastAsia="es-ES"/>
             </w:rPr>
           </w:pPr>
-          <w:hyperlink w:anchor="_Toc226472264" w:history="1">
+          <w:hyperlink w:anchor="_Toc228392859" w:history="1">
             <w:r>
               <w:rPr>
                 <w:rStyle w:val="Hipervnculo"/>
@@ -904,7 +1266,7 @@
                 <w:noProof/>
                 <w:webHidden/>
               </w:rPr>
-              <w:instrText xml:space="preserve"> PAGEREF _Toc226472264 \h </w:instrText>
+              <w:instrText xml:space="preserve"> PAGEREF _Toc228392859 \h </w:instrText>
             </w:r>
             <w:r>
               <w:rPr>
@@ -924,7 +1286,7 @@
                 <w:noProof/>
                 <w:webHidden/>
               </w:rPr>
-              <w:t>3</w:t>
+              <w:t>6</w:t>
             </w:r>
             <w:r>
               <w:rPr>
@@ -942,10 +1304,12 @@
               <w:tab w:val="right" w:leader="dot" w:pos="8494"/>
             </w:tabs>
             <w:rPr>
+              <w:rFonts w:eastAsiaTheme="minorEastAsia"/>
               <w:noProof/>
+              <w:lang w:eastAsia="es-ES"/>
             </w:rPr>
           </w:pPr>
-          <w:hyperlink w:anchor="_Toc226472265" w:history="1">
+          <w:hyperlink w:anchor="_Toc228392860" w:history="1">
             <w:r>
               <w:rPr>
                 <w:rStyle w:val="Hipervnculo"/>
@@ -972,7 +1336,7 @@
                 <w:noProof/>
                 <w:webHidden/>
               </w:rPr>
-              <w:instrText xml:space="preserve"> PAGEREF _Toc226472265 \h </w:instrText>
+              <w:instrText xml:space="preserve"> PAGEREF _Toc228392860 \h </w:instrText>
             </w:r>
             <w:r>
               <w:rPr>
@@ -992,7 +1356,7 @@
                 <w:noProof/>
                 <w:webHidden/>
               </w:rPr>
-              <w:t>4</w:t>
+              <w:t>6</w:t>
             </w:r>
             <w:r>
               <w:rPr>
@@ -1015,13 +1379,13 @@
               <w:lang w:eastAsia="es-ES"/>
             </w:rPr>
           </w:pPr>
-          <w:hyperlink w:anchor="_Toc226472266" w:history="1">
+          <w:hyperlink w:anchor="_Toc228392861" w:history="1">
             <w:r>
               <w:rPr>
                 <w:rStyle w:val="Hipervnculo"/>
                 <w:noProof/>
               </w:rPr>
-              <w:t>Descripcion completa</w:t>
+              <w:t>Descripción completa</w:t>
             </w:r>
             <w:r>
               <w:rPr>
@@ -1042,7 +1406,7 @@
                 <w:noProof/>
                 <w:webHidden/>
               </w:rPr>
-              <w:instrText xml:space="preserve"> PAGEREF _Toc226472266 \h </w:instrText>
+              <w:instrText xml:space="preserve"> PAGEREF _Toc228392861 \h </w:instrText>
             </w:r>
             <w:r>
               <w:rPr>
@@ -1062,7 +1426,7 @@
                 <w:noProof/>
                 <w:webHidden/>
               </w:rPr>
-              <w:t>4</w:t>
+              <w:t>6</w:t>
             </w:r>
             <w:r>
               <w:rPr>
@@ -1085,7 +1449,7 @@
               <w:lang w:eastAsia="es-ES"/>
             </w:rPr>
           </w:pPr>
-          <w:hyperlink w:anchor="_Toc226472267" w:history="1">
+          <w:hyperlink w:anchor="_Toc228392862" w:history="1">
             <w:r>
               <w:rPr>
                 <w:rStyle w:val="Hipervnculo"/>
@@ -1112,7 +1476,7 @@
                 <w:noProof/>
                 <w:webHidden/>
               </w:rPr>
-              <w:instrText xml:space="preserve"> PAGEREF _Toc226472267 \h </w:instrText>
+              <w:instrText xml:space="preserve"> PAGEREF _Toc228392862 \h </w:instrText>
             </w:r>
             <w:r>
               <w:rPr>
@@ -1132,7 +1496,7 @@
                 <w:noProof/>
                 <w:webHidden/>
               </w:rPr>
-              <w:t>4</w:t>
+              <w:t>8</w:t>
             </w:r>
             <w:r>
               <w:rPr>
@@ -1155,7 +1519,7 @@
               <w:lang w:eastAsia="es-ES"/>
             </w:rPr>
           </w:pPr>
-          <w:hyperlink w:anchor="_Toc226472268" w:history="1">
+          <w:hyperlink w:anchor="_Toc228392863" w:history="1">
             <w:r>
               <w:rPr>
                 <w:rStyle w:val="Hipervnculo"/>
@@ -1182,7 +1546,7 @@
                 <w:noProof/>
                 <w:webHidden/>
               </w:rPr>
-              <w:instrText xml:space="preserve"> PAGEREF _Toc226472268 \h </w:instrText>
+              <w:instrText xml:space="preserve"> PAGEREF _Toc228392863 \h </w:instrText>
             </w:r>
             <w:r>
               <w:rPr>
@@ -1202,7 +1566,7 @@
                 <w:noProof/>
                 <w:webHidden/>
               </w:rPr>
-              <w:t>5</w:t>
+              <w:t>10</w:t>
             </w:r>
             <w:r>
               <w:rPr>
@@ -1225,7 +1589,7 @@
               <w:lang w:eastAsia="es-ES"/>
             </w:rPr>
           </w:pPr>
-          <w:hyperlink w:anchor="_Toc226472269" w:history="1">
+          <w:hyperlink w:anchor="_Toc228392864" w:history="1">
             <w:r>
               <w:rPr>
                 <w:rStyle w:val="Hipervnculo"/>
@@ -1252,7 +1616,7 @@
                 <w:noProof/>
                 <w:webHidden/>
               </w:rPr>
-              <w:instrText xml:space="preserve"> PAGEREF _Toc226472269 \h </w:instrText>
+              <w:instrText xml:space="preserve"> PAGEREF _Toc228392864 \h </w:instrText>
             </w:r>
             <w:r>
               <w:rPr>
@@ -1272,7 +1636,7 @@
                 <w:noProof/>
                 <w:webHidden/>
               </w:rPr>
-              <w:t>8</w:t>
+              <w:t>13</w:t>
             </w:r>
             <w:r>
               <w:rPr>
@@ -1295,7 +1659,7 @@
               <w:lang w:eastAsia="es-ES"/>
             </w:rPr>
           </w:pPr>
-          <w:hyperlink w:anchor="_Toc226472270" w:history="1">
+          <w:hyperlink w:anchor="_Toc228392865" w:history="1">
             <w:r>
               <w:rPr>
                 <w:rStyle w:val="Hipervnculo"/>
@@ -1322,7 +1686,7 @@
                 <w:noProof/>
                 <w:webHidden/>
               </w:rPr>
-              <w:instrText xml:space="preserve"> PAGEREF _Toc226472270 \h </w:instrText>
+              <w:instrText xml:space="preserve"> PAGEREF _Toc228392865 \h </w:instrText>
             </w:r>
             <w:r>
               <w:rPr>
@@ -1342,7 +1706,217 @@
                 <w:noProof/>
                 <w:webHidden/>
               </w:rPr>
-              <w:t>9</w:t>
+              <w:t>14</w:t>
+            </w:r>
+            <w:r>
+              <w:rPr>
+                <w:noProof/>
+                <w:webHidden/>
+              </w:rPr>
+              <w:fldChar w:fldCharType="end"/>
+            </w:r>
+          </w:hyperlink>
+        </w:p>
+        <w:p>
+          <w:pPr>
+            <w:pStyle w:val="TDC1"/>
+            <w:tabs>
+              <w:tab w:val="right" w:leader="dot" w:pos="8494"/>
+            </w:tabs>
+            <w:rPr>
+              <w:rFonts w:eastAsiaTheme="minorEastAsia"/>
+              <w:noProof/>
+              <w:lang w:eastAsia="es-ES"/>
+            </w:rPr>
+          </w:pPr>
+          <w:hyperlink w:anchor="_Toc228392866" w:history="1">
+            <w:r>
+              <w:rPr>
+                <w:rStyle w:val="Hipervnculo"/>
+                <w:noProof/>
+              </w:rPr>
+              <w:t>Diagrama de secuencia</w:t>
+            </w:r>
+            <w:r>
+              <w:rPr>
+                <w:noProof/>
+                <w:webHidden/>
+              </w:rPr>
+              <w:tab/>
+            </w:r>
+            <w:r>
+              <w:rPr>
+                <w:noProof/>
+                <w:webHidden/>
+              </w:rPr>
+              <w:fldChar w:fldCharType="begin"/>
+            </w:r>
+            <w:r>
+              <w:rPr>
+                <w:noProof/>
+                <w:webHidden/>
+              </w:rPr>
+              <w:instrText xml:space="preserve"> PAGEREF _Toc228392866 \h </w:instrText>
+            </w:r>
+            <w:r>
+              <w:rPr>
+                <w:noProof/>
+                <w:webHidden/>
+              </w:rPr>
+            </w:r>
+            <w:r>
+              <w:rPr>
+                <w:noProof/>
+                <w:webHidden/>
+              </w:rPr>
+              <w:fldChar w:fldCharType="separate"/>
+            </w:r>
+            <w:r>
+              <w:rPr>
+                <w:noProof/>
+                <w:webHidden/>
+              </w:rPr>
+              <w:t>20</w:t>
+            </w:r>
+            <w:r>
+              <w:rPr>
+                <w:noProof/>
+                <w:webHidden/>
+              </w:rPr>
+              <w:fldChar w:fldCharType="end"/>
+            </w:r>
+          </w:hyperlink>
+        </w:p>
+        <w:p>
+          <w:pPr>
+            <w:pStyle w:val="TDC1"/>
+            <w:tabs>
+              <w:tab w:val="right" w:leader="dot" w:pos="8494"/>
+            </w:tabs>
+            <w:rPr>
+              <w:rFonts w:eastAsiaTheme="minorEastAsia"/>
+              <w:noProof/>
+              <w:lang w:eastAsia="es-ES"/>
+            </w:rPr>
+          </w:pPr>
+          <w:hyperlink w:anchor="_Toc228392867" w:history="1">
+            <w:r>
+              <w:rPr>
+                <w:rStyle w:val="Hipervnculo"/>
+                <w:noProof/>
+              </w:rPr>
+              <w:t>Diagrama de paquetes</w:t>
+            </w:r>
+            <w:r>
+              <w:rPr>
+                <w:noProof/>
+                <w:webHidden/>
+              </w:rPr>
+              <w:tab/>
+            </w:r>
+            <w:r>
+              <w:rPr>
+                <w:noProof/>
+                <w:webHidden/>
+              </w:rPr>
+              <w:fldChar w:fldCharType="begin"/>
+            </w:r>
+            <w:r>
+              <w:rPr>
+                <w:noProof/>
+                <w:webHidden/>
+              </w:rPr>
+              <w:instrText xml:space="preserve"> PAGEREF _Toc228392867 \h </w:instrText>
+            </w:r>
+            <w:r>
+              <w:rPr>
+                <w:noProof/>
+                <w:webHidden/>
+              </w:rPr>
+            </w:r>
+            <w:r>
+              <w:rPr>
+                <w:noProof/>
+                <w:webHidden/>
+              </w:rPr>
+              <w:fldChar w:fldCharType="separate"/>
+            </w:r>
+            <w:r>
+              <w:rPr>
+                <w:noProof/>
+                <w:webHidden/>
+              </w:rPr>
+              <w:t>20</w:t>
+            </w:r>
+            <w:r>
+              <w:rPr>
+                <w:noProof/>
+                <w:webHidden/>
+              </w:rPr>
+              <w:fldChar w:fldCharType="end"/>
+            </w:r>
+          </w:hyperlink>
+        </w:p>
+        <w:p>
+          <w:pPr>
+            <w:pStyle w:val="TDC1"/>
+            <w:tabs>
+              <w:tab w:val="right" w:leader="dot" w:pos="8494"/>
+            </w:tabs>
+            <w:rPr>
+              <w:rFonts w:eastAsiaTheme="minorEastAsia"/>
+              <w:noProof/>
+              <w:lang w:eastAsia="es-ES"/>
+            </w:rPr>
+          </w:pPr>
+          <w:hyperlink w:anchor="_Toc228392868" w:history="1">
+            <w:r>
+              <w:rPr>
+                <w:rStyle w:val="Hipervnculo"/>
+                <w:noProof/>
+              </w:rPr>
+              <w:t>Diagrama de objetos</w:t>
+            </w:r>
+            <w:r>
+              <w:rPr>
+                <w:noProof/>
+                <w:webHidden/>
+              </w:rPr>
+              <w:tab/>
+            </w:r>
+            <w:r>
+              <w:rPr>
+                <w:noProof/>
+                <w:webHidden/>
+              </w:rPr>
+              <w:fldChar w:fldCharType="begin"/>
+            </w:r>
+            <w:r>
+              <w:rPr>
+                <w:noProof/>
+                <w:webHidden/>
+              </w:rPr>
+              <w:instrText xml:space="preserve"> PAGEREF _Toc228392868 \h </w:instrText>
+            </w:r>
+            <w:r>
+              <w:rPr>
+                <w:noProof/>
+                <w:webHidden/>
+              </w:rPr>
+            </w:r>
+            <w:r>
+              <w:rPr>
+                <w:noProof/>
+                <w:webHidden/>
+              </w:rPr>
+              <w:fldChar w:fldCharType="separate"/>
+            </w:r>
+            <w:r>
+              <w:rPr>
+                <w:noProof/>
+                <w:webHidden/>
+              </w:rPr>
+              <w:t>21</w:t>
             </w:r>
             <w:r>
               <w:rPr>
@@ -1373,7 +1947,7 @@
       <w:pPr>
         <w:pStyle w:val="Ttulo1"/>
       </w:pPr>
-      <w:bookmarkStart w:id="1" w:name="_Toc226472255"/>
+      <w:bookmarkStart w:id="1" w:name="_Toc228392845"/>
       <w:r>
         <w:t>Índice de ilustraciones</w:t>
       </w:r>
@@ -1386,7 +1960,9 @@
           <w:tab w:val="right" w:leader="dot" w:pos="8494"/>
         </w:tabs>
         <w:rPr>
+          <w:rFonts w:eastAsiaTheme="minorEastAsia"/>
           <w:noProof/>
+          <w:lang w:eastAsia="es-ES"/>
         </w:rPr>
       </w:pPr>
       <w:r>
@@ -1398,27 +1974,13 @@
       <w:r>
         <w:fldChar w:fldCharType="separate"/>
       </w:r>
-      <w:hyperlink w:anchor="_Toc226472271" w:history="1">
+      <w:hyperlink w:anchor="_Toc228392869" w:history="1">
         <w:r>
           <w:rPr>
             <w:rStyle w:val="Hipervnculo"/>
             <w:noProof/>
           </w:rPr>
-          <w:t>Ilustra</w:t>
-        </w:r>
-        <w:r>
-          <w:rPr>
-            <w:rStyle w:val="Hipervnculo"/>
-            <w:noProof/>
-          </w:rPr>
-          <w:t>c</w:t>
-        </w:r>
-        <w:r>
-          <w:rPr>
-            <w:rStyle w:val="Hipervnculo"/>
-            <w:noProof/>
-          </w:rPr>
-          <w:t>ión 1 Entidad-Relacion</w:t>
+          <w:t>Ilustración 1 Diagrama E/R</w:t>
         </w:r>
         <w:r>
           <w:rPr>
@@ -1439,143 +2001,7 @@
             <w:noProof/>
             <w:webHidden/>
           </w:rPr>
-          <w:instrText xml:space="preserve"> PAGEREF _Toc226472271 \h </w:instrText>
-        </w:r>
-        <w:r>
-          <w:rPr>
-            <w:noProof/>
-            <w:webHidden/>
-          </w:rPr>
-        </w:r>
-        <w:r>
-          <w:rPr>
-            <w:noProof/>
-            <w:webHidden/>
-          </w:rPr>
-          <w:fldChar w:fldCharType="separate"/>
-        </w:r>
-        <w:r>
-          <w:rPr>
-            <w:noProof/>
-            <w:webHidden/>
-          </w:rPr>
-          <w:t>5</w:t>
-        </w:r>
-        <w:r>
-          <w:rPr>
-            <w:noProof/>
-            <w:webHidden/>
-          </w:rPr>
-          <w:fldChar w:fldCharType="end"/>
-        </w:r>
-      </w:hyperlink>
-    </w:p>
-    <w:p>
-      <w:pPr>
-        <w:pStyle w:val="Tabladeilustraciones"/>
-        <w:tabs>
-          <w:tab w:val="right" w:leader="dot" w:pos="8494"/>
-        </w:tabs>
-        <w:rPr>
-          <w:noProof/>
-        </w:rPr>
-      </w:pPr>
-      <w:hyperlink w:anchor="_Toc226472272" w:history="1">
-        <w:r>
-          <w:rPr>
-            <w:rStyle w:val="Hipervnculo"/>
-            <w:noProof/>
-          </w:rPr>
-          <w:t>Ilustración 2 Caso de uso Cliente</w:t>
-        </w:r>
-        <w:r>
-          <w:rPr>
-            <w:noProof/>
-            <w:webHidden/>
-          </w:rPr>
-          <w:tab/>
-        </w:r>
-        <w:r>
-          <w:rPr>
-            <w:noProof/>
-            <w:webHidden/>
-          </w:rPr>
-          <w:fldChar w:fldCharType="begin"/>
-        </w:r>
-        <w:r>
-          <w:rPr>
-            <w:noProof/>
-            <w:webHidden/>
-          </w:rPr>
-          <w:instrText xml:space="preserve"> PAGEREF _Toc226472272 \h </w:instrText>
-        </w:r>
-        <w:r>
-          <w:rPr>
-            <w:noProof/>
-            <w:webHidden/>
-          </w:rPr>
-        </w:r>
-        <w:r>
-          <w:rPr>
-            <w:noProof/>
-            <w:webHidden/>
-          </w:rPr>
-          <w:fldChar w:fldCharType="separate"/>
-        </w:r>
-        <w:r>
-          <w:rPr>
-            <w:noProof/>
-            <w:webHidden/>
-          </w:rPr>
-          <w:t>7</w:t>
-        </w:r>
-        <w:r>
-          <w:rPr>
-            <w:noProof/>
-            <w:webHidden/>
-          </w:rPr>
-          <w:fldChar w:fldCharType="end"/>
-        </w:r>
-      </w:hyperlink>
-    </w:p>
-    <w:p>
-      <w:pPr>
-        <w:pStyle w:val="Tabladeilustraciones"/>
-        <w:tabs>
-          <w:tab w:val="right" w:leader="dot" w:pos="8494"/>
-        </w:tabs>
-        <w:rPr>
-          <w:noProof/>
-        </w:rPr>
-      </w:pPr>
-      <w:hyperlink w:anchor="_Toc226472273" w:history="1">
-        <w:r>
-          <w:rPr>
-            <w:rStyle w:val="Hipervnculo"/>
-            <w:noProof/>
-          </w:rPr>
-          <w:t>Ilustración 3 Caso de uso Admin</w:t>
-        </w:r>
-        <w:r>
-          <w:rPr>
-            <w:noProof/>
-            <w:webHidden/>
-          </w:rPr>
-          <w:tab/>
-        </w:r>
-        <w:r>
-          <w:rPr>
-            <w:noProof/>
-            <w:webHidden/>
-          </w:rPr>
-          <w:fldChar w:fldCharType="begin"/>
-        </w:r>
-        <w:r>
-          <w:rPr>
-            <w:noProof/>
-            <w:webHidden/>
-          </w:rPr>
-          <w:instrText xml:space="preserve"> PAGEREF _Toc226472273 \h </w:instrText>
+          <w:instrText xml:space="preserve"> PAGEREF _Toc228392869 \h </w:instrText>
         </w:r>
         <w:r>
           <w:rPr>
@@ -1613,16 +2039,18 @@
           <w:tab w:val="right" w:leader="dot" w:pos="8494"/>
         </w:tabs>
         <w:rPr>
+          <w:rFonts w:eastAsiaTheme="minorEastAsia"/>
           <w:noProof/>
+          <w:lang w:eastAsia="es-ES"/>
         </w:rPr>
       </w:pPr>
-      <w:hyperlink w:anchor="_Toc226472274" w:history="1">
+      <w:hyperlink w:anchor="_Toc228392870" w:history="1">
         <w:r>
           <w:rPr>
             <w:rStyle w:val="Hipervnculo"/>
             <w:noProof/>
           </w:rPr>
-          <w:t>Ilustración 4 Diagrama de Clases</w:t>
+          <w:t>Ilustración 2 Caso de uso Cliente</w:t>
         </w:r>
         <w:r>
           <w:rPr>
@@ -1643,7 +2071,7 @@
             <w:noProof/>
             <w:webHidden/>
           </w:rPr>
-          <w:instrText xml:space="preserve"> PAGEREF _Toc226472274 \h </w:instrText>
+          <w:instrText xml:space="preserve"> PAGEREF _Toc228392870 \h </w:instrText>
         </w:r>
         <w:r>
           <w:rPr>
@@ -1681,16 +2109,32 @@
           <w:tab w:val="right" w:leader="dot" w:pos="8494"/>
         </w:tabs>
         <w:rPr>
+          <w:rFonts w:eastAsiaTheme="minorEastAsia"/>
           <w:noProof/>
+          <w:lang w:eastAsia="es-ES"/>
         </w:rPr>
       </w:pPr>
-      <w:hyperlink w:anchor="_Toc226472275" w:history="1">
+      <w:hyperlink w:anchor="_Toc228392871" w:history="1">
         <w:r>
           <w:rPr>
             <w:rStyle w:val="Hipervnculo"/>
             <w:noProof/>
           </w:rPr>
-          <w:t>Ilustración 5 Diagrama de estados Encargos</w:t>
+          <w:t xml:space="preserve">Ilustración 3 Caso de </w:t>
+        </w:r>
+        <w:r>
+          <w:rPr>
+            <w:rStyle w:val="Hipervnculo"/>
+            <w:noProof/>
+          </w:rPr>
+          <w:t>u</w:t>
+        </w:r>
+        <w:r>
+          <w:rPr>
+            <w:rStyle w:val="Hipervnculo"/>
+            <w:noProof/>
+          </w:rPr>
+          <w:t>so Admin</w:t>
         </w:r>
         <w:r>
           <w:rPr>
@@ -1711,7 +2155,7 @@
             <w:noProof/>
             <w:webHidden/>
           </w:rPr>
-          <w:instrText xml:space="preserve"> PAGEREF _Toc226472275 \h </w:instrText>
+          <w:instrText xml:space="preserve"> PAGEREF _Toc228392871 \h </w:instrText>
         </w:r>
         <w:r>
           <w:rPr>
@@ -1731,7 +2175,7 @@
             <w:noProof/>
             <w:webHidden/>
           </w:rPr>
-          <w:t>12</w:t>
+          <w:t>11</w:t>
         </w:r>
         <w:r>
           <w:rPr>
@@ -1749,16 +2193,18 @@
           <w:tab w:val="right" w:leader="dot" w:pos="8494"/>
         </w:tabs>
         <w:rPr>
+          <w:rFonts w:eastAsiaTheme="minorEastAsia"/>
           <w:noProof/>
+          <w:lang w:eastAsia="es-ES"/>
         </w:rPr>
       </w:pPr>
-      <w:hyperlink w:anchor="_Toc226472276" w:history="1">
+      <w:hyperlink w:anchor="_Toc228392872" w:history="1">
         <w:r>
           <w:rPr>
             <w:rStyle w:val="Hipervnculo"/>
             <w:noProof/>
           </w:rPr>
-          <w:t>Ilustración 6 Diagrma de estados Login</w:t>
+          <w:t>Ilustración 4 Diagrama de Clases</w:t>
         </w:r>
         <w:r>
           <w:rPr>
@@ -1779,7 +2225,7 @@
             <w:noProof/>
             <w:webHidden/>
           </w:rPr>
-          <w:instrText xml:space="preserve"> PAGEREF _Toc226472276 \h </w:instrText>
+          <w:instrText xml:space="preserve"> PAGEREF _Toc228392872 \h </w:instrText>
         </w:r>
         <w:r>
           <w:rPr>
@@ -1811,6 +2257,146 @@
       </w:hyperlink>
     </w:p>
     <w:p>
+      <w:pPr>
+        <w:pStyle w:val="Tabladeilustraciones"/>
+        <w:tabs>
+          <w:tab w:val="right" w:leader="dot" w:pos="8494"/>
+        </w:tabs>
+        <w:rPr>
+          <w:rFonts w:eastAsiaTheme="minorEastAsia"/>
+          <w:noProof/>
+          <w:lang w:eastAsia="es-ES"/>
+        </w:rPr>
+      </w:pPr>
+      <w:hyperlink w:anchor="_Toc228392873" w:history="1">
+        <w:r>
+          <w:rPr>
+            <w:rStyle w:val="Hipervnculo"/>
+            <w:noProof/>
+          </w:rPr>
+          <w:t>Ilustración 5 Diagrama de estados Encargos</w:t>
+        </w:r>
+        <w:r>
+          <w:rPr>
+            <w:noProof/>
+            <w:webHidden/>
+          </w:rPr>
+          <w:tab/>
+        </w:r>
+        <w:r>
+          <w:rPr>
+            <w:noProof/>
+            <w:webHidden/>
+          </w:rPr>
+          <w:fldChar w:fldCharType="begin"/>
+        </w:r>
+        <w:r>
+          <w:rPr>
+            <w:noProof/>
+            <w:webHidden/>
+          </w:rPr>
+          <w:instrText xml:space="preserve"> PAGEREF _Toc228392873 \h </w:instrText>
+        </w:r>
+        <w:r>
+          <w:rPr>
+            <w:noProof/>
+            <w:webHidden/>
+          </w:rPr>
+        </w:r>
+        <w:r>
+          <w:rPr>
+            <w:noProof/>
+            <w:webHidden/>
+          </w:rPr>
+          <w:fldChar w:fldCharType="separate"/>
+        </w:r>
+        <w:r>
+          <w:rPr>
+            <w:noProof/>
+            <w:webHidden/>
+          </w:rPr>
+          <w:t>17</w:t>
+        </w:r>
+        <w:r>
+          <w:rPr>
+            <w:noProof/>
+            <w:webHidden/>
+          </w:rPr>
+          <w:fldChar w:fldCharType="end"/>
+        </w:r>
+      </w:hyperlink>
+    </w:p>
+    <w:p>
+      <w:pPr>
+        <w:pStyle w:val="Tabladeilustraciones"/>
+        <w:tabs>
+          <w:tab w:val="right" w:leader="dot" w:pos="8494"/>
+        </w:tabs>
+        <w:rPr>
+          <w:rFonts w:eastAsiaTheme="minorEastAsia"/>
+          <w:noProof/>
+          <w:lang w:eastAsia="es-ES"/>
+        </w:rPr>
+      </w:pPr>
+      <w:hyperlink w:anchor="_Toc228392874" w:history="1">
+        <w:r>
+          <w:rPr>
+            <w:rStyle w:val="Hipervnculo"/>
+            <w:noProof/>
+          </w:rPr>
+          <w:t>Ilustración 6 Diagrma de estados Login</w:t>
+        </w:r>
+        <w:r>
+          <w:rPr>
+            <w:noProof/>
+            <w:webHidden/>
+          </w:rPr>
+          <w:tab/>
+        </w:r>
+        <w:r>
+          <w:rPr>
+            <w:noProof/>
+            <w:webHidden/>
+          </w:rPr>
+          <w:fldChar w:fldCharType="begin"/>
+        </w:r>
+        <w:r>
+          <w:rPr>
+            <w:noProof/>
+            <w:webHidden/>
+          </w:rPr>
+          <w:instrText xml:space="preserve"> PAGEREF _Toc228392874 \h </w:instrText>
+        </w:r>
+        <w:r>
+          <w:rPr>
+            <w:noProof/>
+            <w:webHidden/>
+          </w:rPr>
+        </w:r>
+        <w:r>
+          <w:rPr>
+            <w:noProof/>
+            <w:webHidden/>
+          </w:rPr>
+          <w:fldChar w:fldCharType="separate"/>
+        </w:r>
+        <w:r>
+          <w:rPr>
+            <w:noProof/>
+            <w:webHidden/>
+          </w:rPr>
+          <w:t>20</w:t>
+        </w:r>
+        <w:r>
+          <w:rPr>
+            <w:noProof/>
+            <w:webHidden/>
+          </w:rPr>
+          <w:fldChar w:fldCharType="end"/>
+        </w:r>
+      </w:hyperlink>
+    </w:p>
+    <w:p>
       <w:r>
         <w:fldChar w:fldCharType="end"/>
       </w:r>
@@ -1824,7 +2410,7 @@
       <w:pPr>
         <w:pStyle w:val="Ttulo1"/>
       </w:pPr>
-      <w:bookmarkStart w:id="2" w:name="_Toc226472256"/>
+      <w:bookmarkStart w:id="2" w:name="_Toc228392846"/>
       <w:r>
         <w:lastRenderedPageBreak/>
         <w:t>Memoria descriptiva</w:t>
@@ -1836,49 +2422,297 @@
       <w:pPr>
         <w:pStyle w:val="Ttulo2"/>
       </w:pPr>
-      <w:bookmarkStart w:id="3" w:name="_Toc226472257"/>
+      <w:bookmarkStart w:id="3" w:name="_Toc228392847"/>
       <w:r>
         <w:t>Introducción</w:t>
       </w:r>
       <w:bookmarkEnd w:id="3"/>
+    </w:p>
+    <w:p>
+      <w:r>
+        <w:t>Este Trabajo de Fin de Grado presenta el diseño, desarrollo e implementación de "Costuras con Mimo", una plataforma web de comercio electrónico (e-</w:t>
+      </w:r>
+      <w:proofErr w:type="spellStart"/>
+      <w:r>
+        <w:t>commerce</w:t>
+      </w:r>
+      <w:proofErr w:type="spellEnd"/>
+      <w:r>
+        <w:t>) orientada a la venta de artículos de costura artesanal. A diferencia de las tiendas online tradicionales, este sistema permite un alto grado de personalización en los pedidos, ofreciendo a los clientes la posibilidad de seleccionar tejidos específicos y añadir detalles únicos, como bordados con nombre.</w:t>
+      </w:r>
+    </w:p>
+    <w:p/>
+    <w:p>
+      <w:pPr>
+        <w:pStyle w:val="Ttulo2"/>
+      </w:pPr>
+      <w:bookmarkStart w:id="4" w:name="_Toc228392848"/>
+      <w:proofErr w:type="spellStart"/>
+      <w:r>
+        <w:t>Abstract</w:t>
+      </w:r>
+      <w:bookmarkEnd w:id="4"/>
+      <w:proofErr w:type="spellEnd"/>
     </w:p>
     <w:p/>
     <w:p/>
     <w:p>
       <w:pPr>
-        <w:pStyle w:val="Ttulo2"/>
-      </w:pPr>
-      <w:bookmarkStart w:id="4" w:name="_Toc226472258"/>
-      <w:proofErr w:type="spellStart"/>
-      <w:r>
-        <w:t>Abstract</w:t>
-      </w:r>
-      <w:bookmarkEnd w:id="4"/>
-      <w:proofErr w:type="spellEnd"/>
+        <w:pStyle w:val="Ttulo3"/>
+      </w:pPr>
+      <w:bookmarkStart w:id="5" w:name="_Toc228392849"/>
+      <w:r>
+        <w:t>Palabras clave</w:t>
+      </w:r>
+      <w:bookmarkEnd w:id="5"/>
     </w:p>
     <w:p/>
     <w:p/>
     <w:p>
       <w:pPr>
-        <w:pStyle w:val="Ttulo3"/>
-      </w:pPr>
-      <w:bookmarkStart w:id="5" w:name="_Toc226472259"/>
-      <w:r>
-        <w:t>Palabras clave</w:t>
-      </w:r>
-      <w:bookmarkEnd w:id="5"/>
+        <w:pStyle w:val="Ttulo1"/>
+      </w:pPr>
+      <w:bookmarkStart w:id="6" w:name="_Toc228392850"/>
+      <w:r>
+        <w:t>Objetivos del proyecto</w:t>
+      </w:r>
+      <w:bookmarkEnd w:id="6"/>
+    </w:p>
+    <w:p>
+      <w:r>
+        <w:t xml:space="preserve">Los principales objetivos que me he marcado para la realización de este proyecto serian: </w:t>
+      </w:r>
+    </w:p>
+    <w:p>
+      <w:pPr>
+        <w:pStyle w:val="Prrafodelista"/>
+        <w:numPr>
+          <w:ilvl w:val="0"/>
+          <w:numId w:val="3"/>
+        </w:numPr>
+      </w:pPr>
+      <w:r>
+        <w:t>El objetivo principal de este proyecto es poder dejar encaminado un producto que pueda salir al mercado lo antes posible.</w:t>
+      </w:r>
+    </w:p>
+    <w:p>
+      <w:r>
+        <w:t xml:space="preserve">Pero poniéndonos un poco más técnicos lo que me gustaría que tuviera esta web serían estos puntos: </w:t>
+      </w:r>
+    </w:p>
+    <w:p>
+      <w:pPr>
+        <w:pStyle w:val="Prrafodelista"/>
+        <w:numPr>
+          <w:ilvl w:val="0"/>
+          <w:numId w:val="3"/>
+        </w:numPr>
+      </w:pPr>
+      <w:r>
+        <w:t>Web responsive: que se pueda ver tanto en un portátil/pantalla de ordenador, como en un teléfono móvil.</w:t>
+      </w:r>
+    </w:p>
+    <w:p>
+      <w:pPr>
+        <w:pStyle w:val="Prrafodelista"/>
+        <w:numPr>
+          <w:ilvl w:val="0"/>
+          <w:numId w:val="3"/>
+        </w:numPr>
+      </w:pPr>
+      <w:r>
+        <w:t>Organización clara y estructurada: quiero coger buenas prácticas y tener el código ordenado es una práctica que me vendrá bien para el futuro</w:t>
+      </w:r>
+    </w:p>
+    <w:p>
+      <w:pPr>
+        <w:pStyle w:val="Prrafodelista"/>
+        <w:numPr>
+          <w:ilvl w:val="0"/>
+          <w:numId w:val="3"/>
+        </w:numPr>
+      </w:pPr>
+      <w:r>
+        <w:t xml:space="preserve"> Vista </w:t>
+      </w:r>
+      <w:proofErr w:type="spellStart"/>
+      <w:r>
+        <w:t>dashboard</w:t>
+      </w:r>
+      <w:proofErr w:type="spellEnd"/>
+      <w:r>
+        <w:t xml:space="preserve"> y vista usuario: una cosa fundamental de esta aplicación es que se pueda administrar desde esta misma, sin necesidad de tocar código o añadir registros a través de una terminal. También que el usuario final tenga una experiencia agradable a lo largo de toda la web.</w:t>
+      </w:r>
+    </w:p>
+    <w:p>
+      <w:pPr>
+        <w:pStyle w:val="Prrafodelista"/>
+        <w:numPr>
+          <w:ilvl w:val="0"/>
+          <w:numId w:val="3"/>
+        </w:numPr>
+      </w:pPr>
+      <w:r>
+        <w:lastRenderedPageBreak/>
+        <w:t>Implementar una pasarela de pago: El otro proyecto que hice, fue similar a este, pero se me quedo una espinilla clavada, ya que no conseguí implementar una pasarela de pagos por falta de tiempo.</w:t>
+      </w:r>
+    </w:p>
+    <w:p>
+      <w:pPr>
+        <w:pStyle w:val="Ttulo1"/>
+      </w:pPr>
+      <w:bookmarkStart w:id="7" w:name="_Toc228392851"/>
+      <w:r>
+        <w:t>Lenguajes empleados</w:t>
+      </w:r>
+      <w:bookmarkEnd w:id="7"/>
+    </w:p>
+    <w:p/>
+    <w:p>
+      <w:pPr>
+        <w:pStyle w:val="Ttulo2"/>
+      </w:pPr>
+      <w:bookmarkStart w:id="8" w:name="_Toc228392852"/>
+      <w:r>
+        <w:t>Vue.js</w:t>
+      </w:r>
+      <w:bookmarkEnd w:id="8"/>
+    </w:p>
+    <w:p>
+      <w:r>
+        <w:t xml:space="preserve">Será el encargado de lo que es el </w:t>
+      </w:r>
+      <w:proofErr w:type="spellStart"/>
+      <w:r>
+        <w:t>frontend</w:t>
+      </w:r>
+      <w:proofErr w:type="spellEnd"/>
+      <w:r>
+        <w:t xml:space="preserve">, trabaja con una mezcla entre HTML, CSS y </w:t>
+      </w:r>
+      <w:proofErr w:type="gramStart"/>
+      <w:r>
+        <w:t>JavaScript</w:t>
+      </w:r>
+      <w:proofErr w:type="gramEnd"/>
+      <w:r>
+        <w:t xml:space="preserve"> pero un poco diferente. Un detalle que a mi parecer lo hace muy buen lenguaje de programación, es para el tema del enrutamiento, ya que trabaja a través de Vue Ruter.</w:t>
+      </w:r>
+    </w:p>
+    <w:p/>
+    <w:p>
+      <w:pPr>
+        <w:pStyle w:val="Ttulo2"/>
+      </w:pPr>
+      <w:bookmarkStart w:id="9" w:name="_Toc228392853"/>
+      <w:r>
+        <w:t>Django</w:t>
+      </w:r>
+      <w:bookmarkEnd w:id="9"/>
+    </w:p>
+    <w:p>
+      <w:r>
+        <w:t xml:space="preserve">Django </w:t>
+      </w:r>
+      <w:proofErr w:type="spellStart"/>
+      <w:r>
+        <w:t>rest</w:t>
+      </w:r>
+      <w:proofErr w:type="spellEnd"/>
+      <w:r>
+        <w:t xml:space="preserve"> </w:t>
+      </w:r>
+      <w:proofErr w:type="spellStart"/>
+      <w:r>
+        <w:t>framework</w:t>
+      </w:r>
+      <w:proofErr w:type="spellEnd"/>
+      <w:r>
+        <w:t xml:space="preserve"> es una biblioteca para construir </w:t>
+      </w:r>
+      <w:proofErr w:type="spellStart"/>
+      <w:r>
+        <w:t>APIs</w:t>
+      </w:r>
+      <w:proofErr w:type="spellEnd"/>
+      <w:r>
+        <w:t xml:space="preserve"> web</w:t>
+      </w:r>
+      <w:r>
+        <w:t>, proporciona una serie de herramientas y funcionalidades que facilitan la creación de interfaces de programación de aplicaciones robustas y fáciles de manejar.</w:t>
+      </w:r>
+    </w:p>
+    <w:p>
+      <w:pPr>
+        <w:pStyle w:val="Ttulo2"/>
+      </w:pPr>
+      <w:bookmarkStart w:id="10" w:name="_Toc228392854"/>
+      <w:proofErr w:type="spellStart"/>
+      <w:r>
+        <w:t>PostgresSQL</w:t>
+      </w:r>
+      <w:bookmarkEnd w:id="10"/>
+      <w:proofErr w:type="spellEnd"/>
+    </w:p>
+    <w:p>
+      <w:r>
+        <w:t xml:space="preserve">Por último, la base de datos, he escogido </w:t>
+      </w:r>
+      <w:proofErr w:type="spellStart"/>
+      <w:r>
+        <w:t>postgres</w:t>
+      </w:r>
+      <w:proofErr w:type="spellEnd"/>
+      <w:r>
+        <w:t xml:space="preserve">, ya que me parece muy robusta y sencilla de manejar, el único punto malo que le </w:t>
+      </w:r>
+      <w:proofErr w:type="gramStart"/>
+      <w:r>
+        <w:t>veo,</w:t>
+      </w:r>
+      <w:proofErr w:type="gramEnd"/>
+      <w:r>
+        <w:t xml:space="preserve"> es a la hora de exportar datos o tener una base de datos en la nube, ya que por el momento no he descubierto manera y si tengo que cambiar de mi PC de sobremesa al portátil, tendría que exportar la base de datos en un archivo e importarla.</w:t>
+      </w:r>
     </w:p>
     <w:p/>
     <w:p/>
     <w:p>
       <w:pPr>
-        <w:pStyle w:val="Ttulo1"/>
-      </w:pPr>
-      <w:bookmarkStart w:id="6" w:name="_Toc226472260"/>
-      <w:r>
-        <w:t>Objetivos del proyecto</w:t>
-      </w:r>
-      <w:bookmarkEnd w:id="6"/>
+        <w:pStyle w:val="Ttulo2"/>
+      </w:pPr>
+      <w:bookmarkStart w:id="11" w:name="_Toc228392855"/>
+      <w:r>
+        <w:t>Servicios externos:</w:t>
+      </w:r>
+      <w:bookmarkEnd w:id="11"/>
+    </w:p>
+    <w:p>
+      <w:pPr>
+        <w:pStyle w:val="Ttulo3"/>
+      </w:pPr>
+      <w:bookmarkStart w:id="12" w:name="_Toc228392856"/>
+      <w:r>
+        <w:t>Stripe</w:t>
+      </w:r>
+      <w:bookmarkEnd w:id="12"/>
+    </w:p>
+    <w:p>
+      <w:r>
+        <w:t>Stripe es una pasarle de pagos qu</w:t>
+      </w:r>
+      <w:r>
+        <w:t>e</w:t>
+      </w:r>
+      <w:r>
+        <w:t xml:space="preserve"> se</w:t>
+      </w:r>
+      <w:r>
+        <w:t xml:space="preserve"> encarga de cobrar a los clientes con tarjeta de forma 100% segura</w:t>
+      </w:r>
+      <w:r>
+        <w:t>, tras un tiempo de investigación y varias pruebas, he decidido quedarme con esta plataforma, ya que por el momento me ofrece todo lo que necesito y es bastante sencilla a la hora de implementarla.</w:t>
+      </w:r>
     </w:p>
     <w:p/>
     <w:p/>
@@ -1886,95 +2720,188 @@
       <w:pPr>
         <w:pStyle w:val="Ttulo1"/>
       </w:pPr>
-      <w:bookmarkStart w:id="7" w:name="_Toc226472261"/>
-      <w:r>
-        <w:t>Lenguajes empleados</w:t>
-      </w:r>
-      <w:bookmarkEnd w:id="7"/>
+      <w:bookmarkStart w:id="13" w:name="_Toc228392857"/>
+      <w:r>
+        <w:lastRenderedPageBreak/>
+        <w:t>Recursos</w:t>
+      </w:r>
+      <w:bookmarkEnd w:id="13"/>
     </w:p>
     <w:p/>
     <w:p/>
+    <w:p>
+      <w:pPr>
+        <w:pStyle w:val="Ttulo2"/>
+      </w:pPr>
+      <w:bookmarkStart w:id="14" w:name="_Toc228392858"/>
+      <w:r>
+        <w:t>Hardware</w:t>
+      </w:r>
+      <w:bookmarkEnd w:id="14"/>
+    </w:p>
     <w:p/>
     <w:p>
       <w:pPr>
-        <w:pStyle w:val="Ttulo1"/>
-      </w:pPr>
-      <w:bookmarkStart w:id="8" w:name="_Toc226472262"/>
-      <w:r>
-        <w:t>Recursos</w:t>
-      </w:r>
-      <w:bookmarkEnd w:id="8"/>
+        <w:pStyle w:val="Ttulo2"/>
+      </w:pPr>
+      <w:bookmarkStart w:id="15" w:name="_Toc228392859"/>
+      <w:r>
+        <w:t>Software</w:t>
+      </w:r>
+      <w:bookmarkEnd w:id="15"/>
+    </w:p>
+    <w:p/>
+    <w:p>
+      <w:pPr>
+        <w:pStyle w:val="Ttulo2"/>
+      </w:pPr>
+      <w:bookmarkStart w:id="16" w:name="_Toc228392860"/>
+      <w:r>
+        <w:t>Humanos</w:t>
+      </w:r>
+      <w:bookmarkEnd w:id="16"/>
     </w:p>
     <w:p/>
     <w:p/>
     <w:p>
       <w:pPr>
-        <w:pStyle w:val="Ttulo2"/>
-      </w:pPr>
-      <w:bookmarkStart w:id="9" w:name="_Toc226472263"/>
-      <w:r>
-        <w:t>Hardware</w:t>
-      </w:r>
-      <w:bookmarkEnd w:id="9"/>
+        <w:pStyle w:val="Ttulo1"/>
+      </w:pPr>
+      <w:bookmarkStart w:id="17" w:name="_Toc228392861"/>
+      <w:r>
+        <w:t>Descripción</w:t>
+      </w:r>
+      <w:r>
+        <w:t xml:space="preserve"> completa</w:t>
+      </w:r>
+      <w:bookmarkEnd w:id="17"/>
     </w:p>
     <w:p/>
     <w:p>
-      <w:pPr>
-        <w:pStyle w:val="Ttulo2"/>
-      </w:pPr>
-      <w:bookmarkStart w:id="10" w:name="_Toc226472264"/>
-      <w:r>
-        <w:t>Software</w:t>
-      </w:r>
-      <w:bookmarkEnd w:id="10"/>
+      <w:r>
+        <w:t>La web constará principalmente de dos vistas, la primera creada para el usuario, donde según accedas a la web se encontrará con un catálogo con los productos disponibles, junto a su precio y un botón donde acederas a un “</w:t>
+      </w:r>
+      <w:proofErr w:type="spellStart"/>
+      <w:r>
+        <w:t>product</w:t>
+      </w:r>
+      <w:proofErr w:type="spellEnd"/>
+      <w:r>
+        <w:t xml:space="preserve"> </w:t>
+      </w:r>
+      <w:proofErr w:type="spellStart"/>
+      <w:r>
+        <w:t>details</w:t>
+      </w:r>
+      <w:proofErr w:type="spellEnd"/>
+      <w:r>
+        <w:t>” en el cual se podrá observar una pequeña descripción del producto, el precio y un botón de añadir al carrito, también contaras con un menú de navegación.</w:t>
+      </w:r>
+    </w:p>
+    <w:p>
+      <w:r>
+        <w:t>Ahí aparecerá la opción de encargo, donde podrás crear un producto personalizado eligiendo el producto que quieres, la tela con lo que lo quieres hacer y si quieres un bordado.</w:t>
+      </w:r>
+    </w:p>
+    <w:p>
+      <w:r>
+        <w:t xml:space="preserve">Siguiendo con las vistas tendremos la del carrito de la compra, a través de la cuál podremos ver los productos que tenemos en él, tendremos un par de funciones para comprar varios productos de un mismo tipo sin tener que añadir uno a uno estos productos, por otro </w:t>
+      </w:r>
+      <w:proofErr w:type="gramStart"/>
+      <w:r>
+        <w:t>lado</w:t>
+      </w:r>
+      <w:proofErr w:type="gramEnd"/>
+      <w:r>
+        <w:t xml:space="preserve"> tendremos el botón de pagar, que nos llevará a otra ventana en la que deberemos de meter la tarjeta con los datos correspondientes. </w:t>
+      </w:r>
+    </w:p>
+    <w:p>
+      <w:r>
+        <w:t xml:space="preserve">La última vista del usuario </w:t>
+      </w:r>
+      <w:proofErr w:type="gramStart"/>
+      <w:r>
+        <w:t>corriente,</w:t>
+      </w:r>
+      <w:proofErr w:type="gramEnd"/>
+      <w:r>
+        <w:t xml:space="preserve"> será una de perfil, donde podrá ver los datos personales con los que se ha registrado, es decir, dirección y correo y donde podrá también consultar los diferentes pedidos que ha hecho y su estado actualmente, si esta pagado, o </w:t>
+      </w:r>
+      <w:proofErr w:type="spellStart"/>
+      <w:r>
+        <w:t>esta</w:t>
+      </w:r>
+      <w:proofErr w:type="spellEnd"/>
+      <w:r>
+        <w:t xml:space="preserve"> pendiente de aprobación o </w:t>
+      </w:r>
+      <w:proofErr w:type="spellStart"/>
+      <w:r>
+        <w:t>esta</w:t>
+      </w:r>
+      <w:proofErr w:type="spellEnd"/>
+      <w:r>
+        <w:t xml:space="preserve"> en entrega.</w:t>
+      </w:r>
     </w:p>
     <w:p/>
     <w:p>
-      <w:pPr>
-        <w:pStyle w:val="Ttulo2"/>
-      </w:pPr>
-      <w:bookmarkStart w:id="11" w:name="_Toc226472265"/>
       <w:r>
         <w:lastRenderedPageBreak/>
-        <w:t>Humanos</w:t>
-      </w:r>
-      <w:bookmarkEnd w:id="11"/>
+        <w:t xml:space="preserve">En cambio, si inicias sesión con un </w:t>
+      </w:r>
+      <w:r>
+        <w:t xml:space="preserve">administrador, la vista que te aparecerá de primeras, será un </w:t>
+      </w:r>
+      <w:proofErr w:type="spellStart"/>
+      <w:r>
+        <w:t>dashboar</w:t>
+      </w:r>
+      <w:proofErr w:type="spellEnd"/>
+      <w:r>
+        <w:t xml:space="preserve">, en el q tendrás, un listado de los productos, donde podrás cambiar tanto el stock, como el nombre o el precio de estos, también tendrás a un lateral los últimos pedidos realizados, en donde podrás actualizar el estado de estos, por </w:t>
+      </w:r>
+      <w:proofErr w:type="gramStart"/>
+      <w:r>
+        <w:t>ultimo</w:t>
+      </w:r>
+      <w:proofErr w:type="gramEnd"/>
+      <w:r>
+        <w:t xml:space="preserve"> a modo de </w:t>
+      </w:r>
+      <w:proofErr w:type="spellStart"/>
+      <w:r>
+        <w:t>footer</w:t>
+      </w:r>
+      <w:proofErr w:type="spellEnd"/>
+      <w:r>
+        <w:t xml:space="preserve">, tendremos un pequeño análisis de las ventas del </w:t>
+      </w:r>
+      <w:proofErr w:type="spellStart"/>
+      <w:r>
+        <w:t>ultimo</w:t>
+      </w:r>
+      <w:proofErr w:type="spellEnd"/>
+      <w:r>
+        <w:t xml:space="preserve"> mes (por ejemplo).</w:t>
+      </w:r>
     </w:p>
     <w:p/>
-    <w:p/>
     <w:p>
       <w:pPr>
         <w:pStyle w:val="Ttulo1"/>
       </w:pPr>
-      <w:bookmarkStart w:id="12" w:name="_Toc226472266"/>
-      <w:proofErr w:type="spellStart"/>
-      <w:r>
-        <w:t>Descripcion</w:t>
-      </w:r>
-      <w:proofErr w:type="spellEnd"/>
-      <w:r>
-        <w:t xml:space="preserve"> completa</w:t>
-      </w:r>
-      <w:bookmarkEnd w:id="12"/>
-    </w:p>
-    <w:p/>
-    <w:p/>
-    <w:p/>
-    <w:p>
-      <w:pPr>
-        <w:pStyle w:val="Ttulo1"/>
-      </w:pPr>
-      <w:bookmarkStart w:id="13" w:name="_Toc226472267"/>
-      <w:r>
+      <w:bookmarkStart w:id="18" w:name="_Toc228392862"/>
+      <w:r>
+        <w:lastRenderedPageBreak/>
         <w:t>Base de datos</w:t>
       </w:r>
       <w:r>
         <w:t>(E/R)</w:t>
       </w:r>
-      <w:bookmarkEnd w:id="13"/>
-    </w:p>
-    <w:p/>
-    <w:p/>
+      <w:bookmarkEnd w:id="18"/>
+    </w:p>
     <w:p>
       <w:pPr>
         <w:keepNext/>
@@ -1984,10 +2911,10 @@
           <w:noProof/>
         </w:rPr>
         <w:drawing>
-          <wp:inline distT="0" distB="0" distL="0" distR="0" wp14:anchorId="0861B655" wp14:editId="279C836B">
-            <wp:extent cx="5400040" cy="3490595"/>
+          <wp:inline distT="0" distB="0" distL="0" distR="0" wp14:anchorId="03A19F17" wp14:editId="49AD659B">
+            <wp:extent cx="5400040" cy="6819900"/>
             <wp:effectExtent l="0" t="0" r="0" b="0"/>
-            <wp:docPr id="1407880377" name="Imagen 1"/>
+            <wp:docPr id="1239725298" name="Imagen 1"/>
             <wp:cNvGraphicFramePr>
               <a:graphicFrameLocks xmlns:a="http://schemas.openxmlformats.org/drawingml/2006/main" noChangeAspect="1"/>
             </wp:cNvGraphicFramePr>
@@ -1995,163 +2922,7 @@
               <a:graphicData uri="http://schemas.openxmlformats.org/drawingml/2006/picture">
                 <pic:pic xmlns:pic="http://schemas.openxmlformats.org/drawingml/2006/picture">
                   <pic:nvPicPr>
-                    <pic:cNvPr id="1407880377" name=""/>
-                    <pic:cNvPicPr/>
-                  </pic:nvPicPr>
-                  <pic:blipFill>
-                    <a:blip r:embed="rId8"/>
-                    <a:stretch>
-                      <a:fillRect/>
-                    </a:stretch>
-                  </pic:blipFill>
-                  <pic:spPr>
-                    <a:xfrm>
-                      <a:off x="0" y="0"/>
-                      <a:ext cx="5400040" cy="3490595"/>
-                    </a:xfrm>
-                    <a:prstGeom prst="rect">
-                      <a:avLst/>
-                    </a:prstGeom>
-                  </pic:spPr>
-                </pic:pic>
-              </a:graphicData>
-            </a:graphic>
-          </wp:inline>
-        </w:drawing>
-      </w:r>
-    </w:p>
-    <w:p>
-      <w:pPr>
-        <w:pStyle w:val="Descripcin"/>
-        <w:jc w:val="center"/>
-      </w:pPr>
-      <w:bookmarkStart w:id="14" w:name="_Toc226472271"/>
-      <w:r>
-        <w:t xml:space="preserve">Ilustración </w:t>
-      </w:r>
-      <w:r>
-        <w:fldChar w:fldCharType="begin"/>
-      </w:r>
-      <w:r>
-        <w:instrText xml:space="preserve"> SEQ Ilustración \* ARABIC </w:instrText>
-      </w:r>
-      <w:r>
-        <w:fldChar w:fldCharType="separate"/>
-      </w:r>
-      <w:r>
-        <w:rPr>
-          <w:noProof/>
-        </w:rPr>
-        <w:t>1</w:t>
-      </w:r>
-      <w:r>
-        <w:fldChar w:fldCharType="end"/>
-      </w:r>
-      <w:r>
-        <w:t xml:space="preserve"> Entidad-</w:t>
-      </w:r>
-      <w:proofErr w:type="spellStart"/>
-      <w:r>
-        <w:t>Relacion</w:t>
-      </w:r>
-      <w:bookmarkEnd w:id="14"/>
-      <w:proofErr w:type="spellEnd"/>
-    </w:p>
-    <w:p/>
-    <w:p>
-      <w:r>
-        <w:t>La base de datos va a contener estas tablas, usuarios, categorías, tejidos, pedidos, productos, encargos, detalles del pedido, y favoritos.</w:t>
-      </w:r>
-    </w:p>
-    <w:p/>
-    <w:p>
-      <w:r>
-        <w:lastRenderedPageBreak/>
-        <w:t xml:space="preserve">Para empezar, la tabla de usuarios guarda el id, nombre, email, contraseña y el campo </w:t>
-      </w:r>
-      <w:proofErr w:type="spellStart"/>
-      <w:r>
-        <w:t>is_staff</w:t>
-      </w:r>
-      <w:proofErr w:type="spellEnd"/>
-      <w:r>
-        <w:t>. Este último es clave, porque si está en true identifica al administrador, permitiéndole entrar a una vista especial para gestionar el catálogo</w:t>
-      </w:r>
-      <w:r>
-        <w:t>.</w:t>
-      </w:r>
-    </w:p>
-    <w:p>
-      <w:r>
-        <w:t>Luego están las tablas de categorías y tejidos. La primera sirve para clasificar los artículos (como "Bebé" o "Hogar") y la segunda para que la artesana suba el catálogo de telas disponibles con su foto. Estas conectan directamente con la tabla de productos, donde registramos el nombre, precio, imagen y el stock. Como es artesanía, si el stock es 1 el producto se ve, y si baja a 0 el sistema lo oculta automáticamente de la tienda.</w:t>
-      </w:r>
-    </w:p>
-    <w:p>
-      <w:r>
-        <w:t>Para que los usuarios guarden lo que les gusta, he metido la tabla de favoritos. Es una tabla intermedia que vincula el ID del usuario con el ID del producto, permitiendo que la "estrellita" de la web se quede encendida cuando el cliente vuelve a entrar.</w:t>
-      </w:r>
-    </w:p>
-    <w:p>
-      <w:r>
-        <w:t xml:space="preserve">La parte de las ventas se divide en pedidos y </w:t>
-      </w:r>
-      <w:proofErr w:type="spellStart"/>
-      <w:r>
-        <w:t>detalle_pedido</w:t>
-      </w:r>
-      <w:proofErr w:type="spellEnd"/>
-      <w:r>
-        <w:t xml:space="preserve">. En la de pedidos guardamos la cabecera: quién compra, la fecha, el total, el estado del pago y la dirección de envío. Pero como un cliente puede comprar varias cosas a la vez, usamos la tabla </w:t>
-      </w:r>
-      <w:proofErr w:type="spellStart"/>
-      <w:r>
-        <w:t>detalle_pedido</w:t>
-      </w:r>
-      <w:proofErr w:type="spellEnd"/>
-      <w:r>
-        <w:t xml:space="preserve"> para desglosar cada artículo, guardando el precio que tenía en ese momento exacto por si luego la artesana lo cambia en el catálogo general.</w:t>
-      </w:r>
-    </w:p>
-    <w:p>
-      <w:r>
-        <w:t>Finalmente, la tabla de encargos gestiona las personalizaciones. Aquí se guarda el tipo de producto que han pedido, el ID de la tela elegida y el nombre que hay que bordar, además de llevar un control propio del estado de fabricación de ese encargo específico.</w:t>
-      </w:r>
-    </w:p>
-    <w:p/>
-    <w:p/>
-    <w:p>
-      <w:pPr>
-        <w:pStyle w:val="Ttulo1"/>
-      </w:pPr>
-      <w:bookmarkStart w:id="15" w:name="_Toc226472268"/>
-      <w:r>
-        <w:t>Diagrama de casos de uso</w:t>
-      </w:r>
-      <w:bookmarkEnd w:id="15"/>
-    </w:p>
-    <w:p/>
-    <w:p>
-      <w:pPr>
-        <w:keepNext/>
-      </w:pPr>
-      <w:r>
-        <w:rPr>
-          <w:noProof/>
-        </w:rPr>
-        <w:lastRenderedPageBreak/>
-        <w:drawing>
-          <wp:inline distT="0" distB="0" distL="0" distR="0" wp14:anchorId="27541A08" wp14:editId="607775AD">
-            <wp:extent cx="5400040" cy="3972560"/>
-            <wp:effectExtent l="0" t="0" r="0" b="8890"/>
-            <wp:docPr id="370553023" name="Imagen 1"/>
-            <wp:cNvGraphicFramePr>
-              <a:graphicFrameLocks xmlns:a="http://schemas.openxmlformats.org/drawingml/2006/main" noChangeAspect="1"/>
-            </wp:cNvGraphicFramePr>
-            <a:graphic xmlns:a="http://schemas.openxmlformats.org/drawingml/2006/main">
-              <a:graphicData uri="http://schemas.openxmlformats.org/drawingml/2006/picture">
-                <pic:pic xmlns:pic="http://schemas.openxmlformats.org/drawingml/2006/picture">
-                  <pic:nvPicPr>
-                    <pic:cNvPr id="370553023" name=""/>
+                    <pic:cNvPr id="1239725298" name=""/>
                     <pic:cNvPicPr/>
                   </pic:nvPicPr>
                   <pic:blipFill>
@@ -2163,7 +2934,7 @@
                   <pic:spPr>
                     <a:xfrm>
                       <a:off x="0" y="0"/>
-                      <a:ext cx="5400040" cy="3972560"/>
+                      <a:ext cx="5400040" cy="6819900"/>
                     </a:xfrm>
                     <a:prstGeom prst="rect">
                       <a:avLst/>
@@ -2181,7 +2952,7 @@
         <w:pStyle w:val="Descripcin"/>
         <w:jc w:val="center"/>
       </w:pPr>
-      <w:bookmarkStart w:id="16" w:name="_Toc226472272"/>
+      <w:bookmarkStart w:id="19" w:name="_Toc228392869"/>
       <w:r>
         <w:t xml:space="preserve">Ilustración </w:t>
       </w:r>
@@ -2198,82 +2969,89 @@
         <w:rPr>
           <w:noProof/>
         </w:rPr>
-        <w:t>2</w:t>
+        <w:t>1</w:t>
       </w:r>
       <w:r>
         <w:fldChar w:fldCharType="end"/>
       </w:r>
       <w:r>
-        <w:t xml:space="preserve"> Caso de uso Cliente</w:t>
-      </w:r>
-      <w:bookmarkEnd w:id="16"/>
+        <w:t xml:space="preserve"> Diagrama E/R</w:t>
+      </w:r>
+      <w:bookmarkEnd w:id="19"/>
     </w:p>
     <w:p/>
     <w:p>
       <w:r>
-        <w:t>En cuanto a las funcionalidades de la web, he diseñado este diagrama de casos de uso centrado en el Cliente/Usuario. Al entrar en la página, lo primero es el Login, que obligatoriamente (&lt;&lt;</w:t>
+        <w:t>La base de datos va a contener estas tablas, usuarios, categorías, tejidos, pedidos, productos, encargos, detalles del pedido, y favoritos.</w:t>
+      </w:r>
+    </w:p>
+    <w:p/>
+    <w:p>
+      <w:r>
+        <w:lastRenderedPageBreak/>
+        <w:t xml:space="preserve">Para empezar, la tabla de usuarios guarda el id, nombre, email, contraseña y el campo </w:t>
       </w:r>
       <w:proofErr w:type="spellStart"/>
       <w:r>
-        <w:t>include</w:t>
+        <w:t>is_staff</w:t>
       </w:r>
       <w:proofErr w:type="spellEnd"/>
       <w:r>
-        <w:t>&gt;&gt;) tiene que conectar con la Validación de credenciales en la base de datos para comprobar que el usuario y la contraseña son correctos.</w:t>
-      </w:r>
-    </w:p>
-    <w:p>
-      <w:r>
-        <w:t xml:space="preserve">Una vez </w:t>
+        <w:t>. Este último es clave, porque si está en true identifica al administrador, permitiéndole entrar a una vista especial para gestionar el catálogo</w:t>
+      </w:r>
+      <w:r>
+        <w:t>.</w:t>
+      </w:r>
+    </w:p>
+    <w:p>
+      <w:r>
+        <w:t>Luego están las tablas de categorías y tejidos. La primera sirve para clasificar los artículos (como "Bebé" o "Hogar") y la segunda para que la artesana suba el catálogo de telas disponibles con su foto. Estas conectan directamente con la tabla de productos, donde registramos el nombre, precio, imagen y el stock. Como es artesanía, si el stock es 1 el producto se ve, y si baja a 0 el sistema lo oculta automáticamente de la tienda.</w:t>
+      </w:r>
+    </w:p>
+    <w:p>
+      <w:r>
+        <w:t>Para que los usuarios guarden lo que les gusta, he metido la tabla de favoritos. Es una tabla intermedia que vincula el ID del usuario con el ID del producto, permitiendo que la "estrellita" de la web se quede encendida cuando el cliente vuelve a entrar.</w:t>
+      </w:r>
+    </w:p>
+    <w:p>
+      <w:r>
+        <w:t xml:space="preserve">La parte de las ventas se divide en pedidos y </w:t>
       </w:r>
       <w:proofErr w:type="spellStart"/>
       <w:r>
-        <w:t>logueado</w:t>
+        <w:t>detalle_pedido</w:t>
       </w:r>
       <w:proofErr w:type="spellEnd"/>
       <w:r>
-        <w:t>, el usuario tiene acceso a tres grandes áreas. La primera es la tienda pura y dura: puede Ver el catálogo, lo que internamente lanza la acción de Listar productos para que aparezcan en pantalla. Desde ahí, puede decidir Hacer un pedido, proceso que incluye obligatoriamente (&lt;&lt;</w:t>
+        <w:t xml:space="preserve">. En la de pedidos guardamos la cabecera: quién compra, la fecha, el total, el estado del pago y la dirección de envío. Pero como un cliente puede comprar varias cosas a la vez, usamos la tabla </w:t>
       </w:r>
       <w:proofErr w:type="spellStart"/>
       <w:r>
-        <w:t>include</w:t>
+        <w:t>detalle_pedido</w:t>
       </w:r>
       <w:proofErr w:type="spellEnd"/>
       <w:r>
-        <w:t>&gt;&gt;) pasar por la pasarela de Pago para confirmar la compra.</w:t>
-      </w:r>
-    </w:p>
-    <w:p>
-      <w:r>
-        <w:t>La segunda gran área es la personalización. Aquí es donde gestionamos el Encargo. Al configurar su producto, el cliente tiene que Elegir la tela obligatoriamente (&lt;&lt;</w:t>
-      </w:r>
-      <w:proofErr w:type="spellStart"/>
-      <w:r>
-        <w:t>include</w:t>
-      </w:r>
-      <w:proofErr w:type="spellEnd"/>
-      <w:r>
-        <w:t>&gt;&gt;), pero además le damos la opción de Añadir Bordado. Esta relación es un &lt;&lt;</w:t>
-      </w:r>
-      <w:proofErr w:type="spellStart"/>
-      <w:r>
-        <w:t>extend</w:t>
-      </w:r>
-      <w:proofErr w:type="spellEnd"/>
-      <w:r>
-        <w:t>&gt;&gt; porque es totalmente opcional: el cliente puede decidir bordar un nombre o dejar el producto tal cual.</w:t>
-      </w:r>
-    </w:p>
-    <w:p>
-      <w:r>
-        <w:t xml:space="preserve">Por último, he añadido un bloque para la Gestión de Favoritos. El usuario puede Listar sus favoritos (donde también incluimos la posibilidad de Filtrar por favoritos para encontrar algo rápido). Desde su panel de control o desde la ficha de </w:t>
-      </w:r>
+        <w:t xml:space="preserve"> para desglosar cada artículo, guardando el precio que tenía en ese momento exacto por si luego la artesana lo cambia en el catálogo general.</w:t>
+      </w:r>
+    </w:p>
+    <w:p>
+      <w:r>
+        <w:t>Finalmente, la tabla de encargos gestiona las personalizaciones. Aquí se guarda el tipo de producto que han pedido, el ID de la tela elegida y el nombre que hay que bordar, además de llevar un control propio del estado de fabricación de ese encargo específico.</w:t>
+      </w:r>
+    </w:p>
+    <w:p/>
+    <w:p/>
+    <w:p>
+      <w:pPr>
+        <w:pStyle w:val="Ttulo1"/>
+      </w:pPr>
+      <w:bookmarkStart w:id="20" w:name="_Toc228392863"/>
       <w:r>
         <w:lastRenderedPageBreak/>
-        <w:t>producto, tiene la opción de Añadir favorito (encendiendo la 'estrellita') o Eliminar favorito si ya no le interesa</w:t>
-      </w:r>
-    </w:p>
-    <w:p/>
+        <w:t>Diagrama de casos de uso</w:t>
+      </w:r>
+      <w:bookmarkEnd w:id="20"/>
+    </w:p>
     <w:p>
       <w:pPr>
         <w:keepNext/>
@@ -2283,10 +3061,10 @@
           <w:noProof/>
         </w:rPr>
         <w:drawing>
-          <wp:inline distT="0" distB="0" distL="0" distR="0" wp14:anchorId="61EA66B5" wp14:editId="78730711">
-            <wp:extent cx="5400040" cy="5356225"/>
-            <wp:effectExtent l="0" t="0" r="0" b="0"/>
-            <wp:docPr id="363384197" name="Imagen 1"/>
+          <wp:inline distT="0" distB="0" distL="0" distR="0" wp14:anchorId="7E8A0474" wp14:editId="1728AEC2">
+            <wp:extent cx="5400040" cy="3691890"/>
+            <wp:effectExtent l="0" t="0" r="0" b="3810"/>
+            <wp:docPr id="148020152" name="Imagen 1"/>
             <wp:cNvGraphicFramePr>
               <a:graphicFrameLocks xmlns:a="http://schemas.openxmlformats.org/drawingml/2006/main" noChangeAspect="1"/>
             </wp:cNvGraphicFramePr>
@@ -2294,7 +3072,7 @@
               <a:graphicData uri="http://schemas.openxmlformats.org/drawingml/2006/picture">
                 <pic:pic xmlns:pic="http://schemas.openxmlformats.org/drawingml/2006/picture">
                   <pic:nvPicPr>
-                    <pic:cNvPr id="363384197" name=""/>
+                    <pic:cNvPr id="148020152" name=""/>
                     <pic:cNvPicPr/>
                   </pic:nvPicPr>
                   <pic:blipFill>
@@ -2306,7 +3084,7 @@
                   <pic:spPr>
                     <a:xfrm>
                       <a:off x="0" y="0"/>
-                      <a:ext cx="5400040" cy="5356225"/>
+                      <a:ext cx="5400040" cy="3691890"/>
                     </a:xfrm>
                     <a:prstGeom prst="rect">
                       <a:avLst/>
@@ -2324,7 +3102,7 @@
         <w:pStyle w:val="Descripcin"/>
         <w:jc w:val="center"/>
       </w:pPr>
-      <w:bookmarkStart w:id="17" w:name="_Toc226472273"/>
+      <w:bookmarkStart w:id="21" w:name="_Toc228392870"/>
       <w:r>
         <w:t xml:space="preserve">Ilustración </w:t>
       </w:r>
@@ -2341,193 +3119,96 @@
         <w:rPr>
           <w:noProof/>
         </w:rPr>
-        <w:t>3</w:t>
+        <w:t>2</w:t>
       </w:r>
       <w:r>
         <w:fldChar w:fldCharType="end"/>
       </w:r>
       <w:r>
-        <w:t xml:space="preserve"> Caso de uso </w:t>
+        <w:t xml:space="preserve"> </w:t>
+      </w:r>
+      <w:r>
+        <w:t>Caso de uso Cliente</w:t>
+      </w:r>
+      <w:bookmarkEnd w:id="21"/>
+    </w:p>
+    <w:p>
+      <w:pPr>
+        <w:keepNext/>
+      </w:pPr>
+    </w:p>
+    <w:p/>
+    <w:p>
+      <w:r>
+        <w:t>En cuanto a las funcionalidades de la web, he diseñado este diagrama de casos de uso centrado en el Cliente/Usuario. Al entrar en la página, lo primero es el Login, que obligatoriamente (&lt;&lt;</w:t>
       </w:r>
       <w:proofErr w:type="spellStart"/>
       <w:r>
-        <w:t>Admin</w:t>
-      </w:r>
-      <w:bookmarkEnd w:id="17"/>
+        <w:t>include</w:t>
+      </w:r>
       <w:proofErr w:type="spellEnd"/>
-    </w:p>
-    <w:p/>
-    <w:p>
-      <w:r>
-        <w:t xml:space="preserve">Para terminar con la parte funcional, he diseñado este diagrama de casos de uso centrado en el </w:t>
-      </w:r>
-      <w:r>
-        <w:rPr>
-          <w:b/>
-          <w:bCs/>
-        </w:rPr>
-        <w:t>Administrador</w:t>
-      </w:r>
-      <w:r>
-        <w:t>, que sería la vista que tiene la artesana para gestionar todo el negocio.</w:t>
-      </w:r>
-    </w:p>
-    <w:p>
-      <w:r>
-        <w:t xml:space="preserve">La administradora interactúa con cuatro bloques principales. El primero y más importante es la gestión del catálogo. Cuando va a </w:t>
-      </w:r>
-      <w:r>
-        <w:rPr>
-          <w:b/>
-          <w:bCs/>
-        </w:rPr>
-        <w:t>Crear producto</w:t>
-      </w:r>
-      <w:r>
-        <w:t>, el diagrama muestra un &lt;&lt;</w:t>
+      <w:r>
+        <w:t>&gt;&gt;) tiene que conectar con la Validación de credenciales en la base de datos para comprobar que el usuario y la contraseña son correctos.</w:t>
+      </w:r>
+    </w:p>
+    <w:p>
+      <w:r>
+        <w:t xml:space="preserve">Una vez </w:t>
       </w:r>
       <w:proofErr w:type="spellStart"/>
       <w:r>
+        <w:t>logueado</w:t>
+      </w:r>
+      <w:proofErr w:type="spellEnd"/>
+      <w:r>
+        <w:t>, el usuario tiene acceso a tres grandes áreas. La primera es la tienda pura y dura: puede Ver el catálogo, lo que internamente lanza la acción de Listar productos para que aparezcan en pantalla. Desde ahí, puede decidir Hacer un pedido, proceso que incluye obligatoriamente (&lt;&lt;</w:t>
+      </w:r>
+      <w:proofErr w:type="spellStart"/>
+      <w:r>
         <w:t>include</w:t>
       </w:r>
       <w:proofErr w:type="spellEnd"/>
       <w:r>
-        <w:t xml:space="preserve">&gt;&gt; hacia </w:t>
-      </w:r>
-      <w:r>
-        <w:rPr>
-          <w:b/>
-          <w:bCs/>
-        </w:rPr>
-        <w:t xml:space="preserve">Crear </w:t>
+        <w:t>&gt;&gt;) pasar por la pasarela de Pago para confirmar la compra.</w:t>
+      </w:r>
+    </w:p>
+    <w:p>
+      <w:r>
+        <w:t>La segunda gran área es la personalización. Aquí es donde gestionamos el Encargo. Al configurar su producto, el cliente tiene que Elegir la tela obligatoriamente (&lt;&lt;</w:t>
       </w:r>
       <w:proofErr w:type="spellStart"/>
       <w:r>
-        <w:rPr>
-          <w:b/>
-          <w:bCs/>
-        </w:rPr>
-        <w:t>categoria</w:t>
+        <w:t>include</w:t>
       </w:r>
       <w:proofErr w:type="spellEnd"/>
       <w:r>
-        <w:t xml:space="preserve">. He puesto esto así porque, si el producto que está creando pertenece a una categoría nueva (por ejemplo, 'Peluches'), el sistema obligatoriamente la tiene que crear antes de poder guardar </w:t>
-      </w:r>
+        <w:t>&gt;&gt;), pero además le damos la opción de Añadir Bordado. Esta relación es un &lt;&lt;</w:t>
+      </w:r>
+      <w:proofErr w:type="spellStart"/>
+      <w:r>
+        <w:t>extend</w:t>
+      </w:r>
+      <w:proofErr w:type="spellEnd"/>
+      <w:r>
+        <w:t>&gt;&gt; porque es totalmente opcional: el cliente puede decidir bordar un nombre o dejar el producto tal cual.</w:t>
+      </w:r>
+    </w:p>
+    <w:p>
       <w:r>
         <w:lastRenderedPageBreak/>
-        <w:t xml:space="preserve">el producto. Una vez creado el producto, puede decidir </w:t>
-      </w:r>
-      <w:r>
-        <w:rPr>
-          <w:b/>
-          <w:bCs/>
-        </w:rPr>
-        <w:t>Modificar producto</w:t>
-      </w:r>
-      <w:r>
-        <w:t>. Esta relación es un &lt;&lt;</w:t>
-      </w:r>
-      <w:proofErr w:type="spellStart"/>
-      <w:r>
-        <w:t>extends</w:t>
-      </w:r>
-      <w:proofErr w:type="spellEnd"/>
-      <w:r>
-        <w:t xml:space="preserve">&gt;&gt; porque es una acción opcional que ocurre </w:t>
-      </w:r>
-      <w:r>
-        <w:rPr>
-          <w:i/>
-          <w:iCs/>
-        </w:rPr>
-        <w:t>a posteriori</w:t>
-      </w:r>
-      <w:r>
-        <w:t>: la artesana crea el producto y, si luego ve que ha puesto mal el precio o quiere cambiar la foto, usa la extensión para modificarlo.</w:t>
-      </w:r>
-    </w:p>
-    <w:p>
-      <w:r>
-        <w:t xml:space="preserve">Los otros dos bloques son más directos. La administradora puede entrar directamente para </w:t>
-      </w:r>
-      <w:r>
-        <w:rPr>
-          <w:b/>
-          <w:bCs/>
-        </w:rPr>
-        <w:t>Crear tejido</w:t>
-      </w:r>
-      <w:r>
-        <w:t xml:space="preserve">, simplemente subiendo la foto y el nombre de una tela nueva. También tiene un acceso directo para </w:t>
-      </w:r>
-      <w:r>
-        <w:rPr>
-          <w:b/>
-          <w:bCs/>
-        </w:rPr>
-        <w:t>Ver pedidos</w:t>
-      </w:r>
-      <w:r>
-        <w:t>, que es su panel de control diario para ver qué compras van entrando.</w:t>
-      </w:r>
-    </w:p>
-    <w:p>
-      <w:r>
-        <w:t>Desde ese panel de 'Ver pedidos', he añadido una extensión &lt;&lt;</w:t>
-      </w:r>
-      <w:proofErr w:type="spellStart"/>
-      <w:r>
-        <w:t>extends</w:t>
-      </w:r>
-      <w:proofErr w:type="spellEnd"/>
-      <w:r>
-        <w:t xml:space="preserve">&gt;&gt; para </w:t>
-      </w:r>
-      <w:r>
-        <w:rPr>
-          <w:b/>
-          <w:bCs/>
-        </w:rPr>
-        <w:t>Cambiar estados</w:t>
-      </w:r>
-      <w:r>
-        <w:t xml:space="preserve">. Lo he puesto como una relación de extensión porque el administrador puede entrar a ver la lista de pedidos pendientes por la mañana simplemente para organizarse, y no necesariamente tiene que </w:t>
-      </w:r>
-      <w:r>
-        <w:t>cambiarles</w:t>
-      </w:r>
-      <w:r>
-        <w:t xml:space="preserve"> el estado a todos en ese momento; solo lo hará cuando coja la máquina de coser y empiece con un pedido específico.</w:t>
-      </w:r>
-    </w:p>
-    <w:p/>
-    <w:p/>
-    <w:p>
-      <w:pPr>
-        <w:pStyle w:val="Ttulo1"/>
-      </w:pPr>
-      <w:bookmarkStart w:id="18" w:name="_Toc226472269"/>
-      <w:r>
-        <w:t>Diagrama de clases</w:t>
-      </w:r>
-      <w:bookmarkEnd w:id="18"/>
-    </w:p>
-    <w:p/>
-    <w:p/>
-    <w:p>
-      <w:pPr>
-        <w:keepNext/>
-      </w:pPr>
+        <w:t>Por último, he añadido un bloque para la Gestión de Favoritos. El usuario puede Listar sus favoritos (donde también incluimos la posibilidad de Filtrar por favoritos para encontrar algo rápido). Desde su panel de control o desde la ficha de producto, tiene la opción de Añadir favorito (encendiendo la 'estrellita') o Eliminar favorito si ya no le interesa</w:t>
+      </w:r>
+    </w:p>
+    <w:p>
       <w:r>
         <w:rPr>
           <w:noProof/>
         </w:rPr>
-        <w:lastRenderedPageBreak/>
         <w:drawing>
-          <wp:inline distT="0" distB="0" distL="0" distR="0" wp14:anchorId="23360423" wp14:editId="36BC8524">
-            <wp:extent cx="5400040" cy="4418330"/>
-            <wp:effectExtent l="0" t="0" r="0" b="1270"/>
-            <wp:docPr id="946551327" name="Imagen 1"/>
+          <wp:inline distT="0" distB="0" distL="0" distR="0" wp14:anchorId="4838C592" wp14:editId="1008ED2F">
+            <wp:extent cx="5400040" cy="4260215"/>
+            <wp:effectExtent l="0" t="0" r="0" b="6985"/>
+            <wp:docPr id="323659546" name="Imagen 1"/>
             <wp:cNvGraphicFramePr>
               <a:graphicFrameLocks xmlns:a="http://schemas.openxmlformats.org/drawingml/2006/main" noChangeAspect="1"/>
             </wp:cNvGraphicFramePr>
@@ -2535,7 +3216,7 @@
               <a:graphicData uri="http://schemas.openxmlformats.org/drawingml/2006/picture">
                 <pic:pic xmlns:pic="http://schemas.openxmlformats.org/drawingml/2006/picture">
                   <pic:nvPicPr>
-                    <pic:cNvPr id="946551327" name=""/>
+                    <pic:cNvPr id="323659546" name=""/>
                     <pic:cNvPicPr/>
                   </pic:nvPicPr>
                   <pic:blipFill>
@@ -2547,7 +3228,7 @@
                   <pic:spPr>
                     <a:xfrm>
                       <a:off x="0" y="0"/>
-                      <a:ext cx="5400040" cy="4418330"/>
+                      <a:ext cx="5400040" cy="4260215"/>
                     </a:xfrm>
                     <a:prstGeom prst="rect">
                       <a:avLst/>
@@ -2563,8 +3244,9 @@
     <w:p>
       <w:pPr>
         <w:pStyle w:val="Descripcin"/>
-      </w:pPr>
-      <w:bookmarkStart w:id="19" w:name="_Toc226472274"/>
+        <w:jc w:val="center"/>
+      </w:pPr>
+      <w:bookmarkStart w:id="22" w:name="_Toc228392871"/>
       <w:r>
         <w:t xml:space="preserve">Ilustración </w:t>
       </w:r>
@@ -2581,44 +3263,182 @@
         <w:rPr>
           <w:noProof/>
         </w:rPr>
-        <w:t>4</w:t>
-      </w:r>
-      <w:r>
-        <w:fldChar w:fldCharType="end"/>
-      </w:r>
-      <w:r>
-        <w:t xml:space="preserve"> Diagrama de Clases</w:t>
-      </w:r>
-      <w:bookmarkEnd w:id="19"/>
-    </w:p>
-    <w:p/>
-    <w:p/>
-    <w:p/>
-    <w:p>
-      <w:pPr>
-        <w:pStyle w:val="Ttulo1"/>
-      </w:pPr>
-      <w:bookmarkStart w:id="20" w:name="_Toc226472270"/>
-      <w:r>
-        <w:t>Diagrama de estados</w:t>
-      </w:r>
-      <w:bookmarkEnd w:id="20"/>
-    </w:p>
-    <w:p/>
-    <w:p>
-      <w:pPr>
-        <w:keepNext/>
-      </w:pPr>
+        <w:t>3</w:t>
+      </w:r>
       <w:r>
         <w:rPr>
           <w:noProof/>
         </w:rPr>
+        <w:fldChar w:fldCharType="end"/>
+      </w:r>
+      <w:r>
+        <w:t xml:space="preserve"> Caso de uso </w:t>
+      </w:r>
+      <w:proofErr w:type="spellStart"/>
+      <w:r>
+        <w:t>Admin</w:t>
+      </w:r>
+      <w:bookmarkEnd w:id="22"/>
+      <w:proofErr w:type="spellEnd"/>
+    </w:p>
+    <w:p/>
+    <w:p>
+      <w:r>
+        <w:t xml:space="preserve">Para terminar con la parte funcional, he diseñado este diagrama de casos de uso centrado en el </w:t>
+      </w:r>
+      <w:r>
+        <w:rPr>
+          <w:b/>
+          <w:bCs/>
+        </w:rPr>
+        <w:t>Administrador</w:t>
+      </w:r>
+      <w:r>
+        <w:t>, que sería la vista que tiene la artesana para gestionar todo el negocio.</w:t>
+      </w:r>
+    </w:p>
+    <w:p>
+      <w:r>
+        <w:t xml:space="preserve">La administradora interactúa con cuatro bloques principales. El primero y más importante es la gestión del catálogo. Cuando va a </w:t>
+      </w:r>
+      <w:r>
+        <w:rPr>
+          <w:b/>
+          <w:bCs/>
+        </w:rPr>
+        <w:t>Crear producto</w:t>
+      </w:r>
+      <w:r>
+        <w:t>, el diagrama muestra un &lt;&lt;</w:t>
+      </w:r>
+      <w:proofErr w:type="spellStart"/>
+      <w:r>
+        <w:t>include</w:t>
+      </w:r>
+      <w:proofErr w:type="spellEnd"/>
+      <w:r>
+        <w:t xml:space="preserve">&gt;&gt; hacia </w:t>
+      </w:r>
+      <w:r>
+        <w:rPr>
+          <w:b/>
+          <w:bCs/>
+        </w:rPr>
+        <w:t xml:space="preserve">Crear </w:t>
+      </w:r>
+      <w:proofErr w:type="spellStart"/>
+      <w:r>
+        <w:rPr>
+          <w:b/>
+          <w:bCs/>
+        </w:rPr>
+        <w:t>categoria</w:t>
+      </w:r>
+      <w:proofErr w:type="spellEnd"/>
+      <w:r>
+        <w:t xml:space="preserve">. He puesto esto así porque, si el producto que está creando pertenece a una categoría nueva (por ejemplo, 'Peluches'), el sistema obligatoriamente la tiene que crear antes de poder guardar el producto. Una vez creado el producto, puede decidir </w:t>
+      </w:r>
+      <w:r>
+        <w:rPr>
+          <w:b/>
+          <w:bCs/>
+        </w:rPr>
+        <w:t>Modificar producto</w:t>
+      </w:r>
+      <w:r>
+        <w:t>. Esta relación es un &lt;&lt;</w:t>
+      </w:r>
+      <w:proofErr w:type="spellStart"/>
+      <w:r>
+        <w:t>extends</w:t>
+      </w:r>
+      <w:proofErr w:type="spellEnd"/>
+      <w:r>
+        <w:t xml:space="preserve">&gt;&gt; porque es una acción opcional que ocurre </w:t>
+      </w:r>
+      <w:r>
+        <w:rPr>
+          <w:i/>
+          <w:iCs/>
+        </w:rPr>
+        <w:t>a posteriori</w:t>
+      </w:r>
+      <w:r>
+        <w:t>: la artesana crea el producto y, si luego ve que ha puesto mal el precio o quiere cambiar la foto, usa la extensión para modificarlo.</w:t>
+      </w:r>
+    </w:p>
+    <w:p>
+      <w:r>
         <w:lastRenderedPageBreak/>
+        <w:t xml:space="preserve">Los otros dos bloques son más directos. La administradora puede entrar directamente para </w:t>
+      </w:r>
+      <w:r>
+        <w:rPr>
+          <w:b/>
+          <w:bCs/>
+        </w:rPr>
+        <w:t>Crear tejido</w:t>
+      </w:r>
+      <w:r>
+        <w:t xml:space="preserve">, simplemente subiendo la foto y el nombre de una tela nueva. También tiene un acceso directo para </w:t>
+      </w:r>
+      <w:r>
+        <w:rPr>
+          <w:b/>
+          <w:bCs/>
+        </w:rPr>
+        <w:t>Ver pedidos</w:t>
+      </w:r>
+      <w:r>
+        <w:t>, que es su panel de control diario para ver qué compras van entrando.</w:t>
+      </w:r>
+    </w:p>
+    <w:p>
+      <w:r>
+        <w:t>Desde ese panel de 'Ver pedidos', he añadido una extensión &lt;&lt;</w:t>
+      </w:r>
+      <w:proofErr w:type="spellStart"/>
+      <w:r>
+        <w:t>extends</w:t>
+      </w:r>
+      <w:proofErr w:type="spellEnd"/>
+      <w:r>
+        <w:t xml:space="preserve">&gt;&gt; para </w:t>
+      </w:r>
+      <w:r>
+        <w:rPr>
+          <w:b/>
+          <w:bCs/>
+        </w:rPr>
+        <w:t>Cambiar estados</w:t>
+      </w:r>
+      <w:r>
+        <w:t>. Lo he puesto como una relación de extensión porque el administrador puede entrar a ver la lista de pedidos pendientes por la mañana simplemente para organizarse, y no necesariamente tiene que cambiarles el estado a todos en ese momento; solo lo hará cuando coja la máquina de coser y empiece con un pedido específico.</w:t>
+      </w:r>
+    </w:p>
+    <w:p/>
+    <w:p/>
+    <w:p>
+      <w:pPr>
+        <w:pStyle w:val="Ttulo1"/>
+      </w:pPr>
+      <w:bookmarkStart w:id="23" w:name="_Toc228392864"/>
+      <w:r>
+        <w:lastRenderedPageBreak/>
+        <w:t>Diagrama de clases</w:t>
+      </w:r>
+      <w:bookmarkEnd w:id="23"/>
+    </w:p>
+    <w:p>
+      <w:r>
+        <w:rPr>
+          <w:noProof/>
+        </w:rPr>
         <w:drawing>
-          <wp:inline distT="0" distB="0" distL="0" distR="0" wp14:anchorId="00F7F434" wp14:editId="26DCDDAF">
-            <wp:extent cx="3381375" cy="8888730"/>
-            <wp:effectExtent l="0" t="0" r="9525" b="7620"/>
-            <wp:docPr id="1472679413" name="Imagen 1"/>
+          <wp:inline distT="0" distB="0" distL="0" distR="0" wp14:anchorId="65DB9073" wp14:editId="3FE4519A">
+            <wp:extent cx="5400040" cy="5458460"/>
+            <wp:effectExtent l="0" t="0" r="0" b="8890"/>
+            <wp:docPr id="882220743" name="Imagen 1"/>
             <wp:cNvGraphicFramePr>
               <a:graphicFrameLocks xmlns:a="http://schemas.openxmlformats.org/drawingml/2006/main" noChangeAspect="1"/>
             </wp:cNvGraphicFramePr>
@@ -2626,36 +3446,23 @@
               <a:graphicData uri="http://schemas.openxmlformats.org/drawingml/2006/picture">
                 <pic:pic xmlns:pic="http://schemas.openxmlformats.org/drawingml/2006/picture">
                   <pic:nvPicPr>
-                    <pic:cNvPr id="0" name="Picture 1"/>
-                    <pic:cNvPicPr>
-                      <a:picLocks noChangeAspect="1" noChangeArrowheads="1"/>
-                    </pic:cNvPicPr>
+                    <pic:cNvPr id="882220743" name=""/>
+                    <pic:cNvPicPr/>
                   </pic:nvPicPr>
                   <pic:blipFill>
-                    <a:blip r:embed="rId12">
-                      <a:extLst>
-                        <a:ext uri="{28A0092B-C50C-407E-A947-70E740481C1C}">
-                          <a14:useLocalDpi xmlns:a14="http://schemas.microsoft.com/office/drawing/2010/main" val="0"/>
-                        </a:ext>
-                      </a:extLst>
-                    </a:blip>
-                    <a:srcRect/>
+                    <a:blip r:embed="rId12"/>
                     <a:stretch>
                       <a:fillRect/>
                     </a:stretch>
                   </pic:blipFill>
-                  <pic:spPr bwMode="auto">
+                  <pic:spPr>
                     <a:xfrm>
                       <a:off x="0" y="0"/>
-                      <a:ext cx="3381375" cy="8888730"/>
+                      <a:ext cx="5400040" cy="5458460"/>
                     </a:xfrm>
                     <a:prstGeom prst="rect">
                       <a:avLst/>
                     </a:prstGeom>
-                    <a:noFill/>
-                    <a:ln>
-                      <a:noFill/>
-                    </a:ln>
                   </pic:spPr>
                 </pic:pic>
               </a:graphicData>
@@ -2667,10 +3474,10 @@
     <w:p>
       <w:pPr>
         <w:pStyle w:val="Descripcin"/>
-      </w:pPr>
-      <w:bookmarkStart w:id="21" w:name="_Toc226472275"/>
-      <w:r>
-        <w:lastRenderedPageBreak/>
+        <w:jc w:val="center"/>
+      </w:pPr>
+      <w:bookmarkStart w:id="24" w:name="_Toc228392872"/>
+      <w:r>
         <w:t xml:space="preserve">Ilustración </w:t>
       </w:r>
       <w:r>
@@ -2686,19 +3493,37 @@
         <w:rPr>
           <w:noProof/>
         </w:rPr>
-        <w:t>5</w:t>
-      </w:r>
-      <w:r>
+        <w:t>4</w:t>
+      </w:r>
+      <w:r>
+        <w:rPr>
+          <w:noProof/>
+        </w:rPr>
         <w:fldChar w:fldCharType="end"/>
       </w:r>
       <w:r>
-        <w:t xml:space="preserve"> Diagrama de estados Encargos</w:t>
-      </w:r>
-      <w:bookmarkEnd w:id="21"/>
-    </w:p>
+        <w:t xml:space="preserve"> Diagrama de Clases</w:t>
+      </w:r>
+      <w:bookmarkEnd w:id="24"/>
+    </w:p>
+    <w:p/>
+    <w:p/>
+    <w:p/>
+    <w:p>
+      <w:pPr>
+        <w:pStyle w:val="Ttulo1"/>
+      </w:pPr>
+      <w:bookmarkStart w:id="25" w:name="_Toc228392865"/>
+      <w:r>
+        <w:t>Diagrama de estados</w:t>
+      </w:r>
+      <w:bookmarkEnd w:id="25"/>
+    </w:p>
+    <w:p/>
     <w:p>
       <w:pPr>
         <w:keepNext/>
+        <w:jc w:val="center"/>
       </w:pPr>
       <w:r>
         <w:rPr>
@@ -2706,10 +3531,10 @@
         </w:rPr>
         <w:lastRenderedPageBreak/>
         <w:drawing>
-          <wp:inline distT="0" distB="0" distL="0" distR="0" wp14:anchorId="1D6CA65E" wp14:editId="411C3BBF">
-            <wp:extent cx="4178300" cy="8888730"/>
-            <wp:effectExtent l="0" t="0" r="0" b="7620"/>
-            <wp:docPr id="729651827" name="Imagen 2"/>
+          <wp:inline distT="0" distB="0" distL="0" distR="0" wp14:anchorId="2A8898DB" wp14:editId="555CD7C9">
+            <wp:extent cx="4315427" cy="6096851"/>
+            <wp:effectExtent l="0" t="0" r="9525" b="0"/>
+            <wp:docPr id="738690499" name="Imagen 1"/>
             <wp:cNvGraphicFramePr>
               <a:graphicFrameLocks xmlns:a="http://schemas.openxmlformats.org/drawingml/2006/main" noChangeAspect="1"/>
             </wp:cNvGraphicFramePr>
@@ -2717,36 +3542,23 @@
               <a:graphicData uri="http://schemas.openxmlformats.org/drawingml/2006/picture">
                 <pic:pic xmlns:pic="http://schemas.openxmlformats.org/drawingml/2006/picture">
                   <pic:nvPicPr>
-                    <pic:cNvPr id="0" name="Picture 2"/>
-                    <pic:cNvPicPr>
-                      <a:picLocks noChangeAspect="1" noChangeArrowheads="1"/>
-                    </pic:cNvPicPr>
+                    <pic:cNvPr id="738690499" name=""/>
+                    <pic:cNvPicPr/>
                   </pic:nvPicPr>
                   <pic:blipFill>
-                    <a:blip r:embed="rId13">
-                      <a:extLst>
-                        <a:ext uri="{28A0092B-C50C-407E-A947-70E740481C1C}">
-                          <a14:useLocalDpi xmlns:a14="http://schemas.microsoft.com/office/drawing/2010/main" val="0"/>
-                        </a:ext>
-                      </a:extLst>
-                    </a:blip>
-                    <a:srcRect/>
+                    <a:blip r:embed="rId13"/>
                     <a:stretch>
                       <a:fillRect/>
                     </a:stretch>
                   </pic:blipFill>
-                  <pic:spPr bwMode="auto">
+                  <pic:spPr>
                     <a:xfrm>
                       <a:off x="0" y="0"/>
-                      <a:ext cx="4178300" cy="8888730"/>
+                      <a:ext cx="4315427" cy="6096851"/>
                     </a:xfrm>
                     <a:prstGeom prst="rect">
                       <a:avLst/>
                     </a:prstGeom>
-                    <a:noFill/>
-                    <a:ln>
-                      <a:noFill/>
-                    </a:ln>
                   </pic:spPr>
                 </pic:pic>
               </a:graphicData>
@@ -2758,10 +3570,92 @@
     <w:p>
       <w:pPr>
         <w:pStyle w:val="Descripcin"/>
-      </w:pPr>
-      <w:bookmarkStart w:id="22" w:name="_Toc226472276"/>
-      <w:r>
+        <w:jc w:val="center"/>
+      </w:pPr>
+      <w:bookmarkStart w:id="26" w:name="_Toc228392873"/>
+      <w:r>
+        <w:t xml:space="preserve">Ilustración </w:t>
+      </w:r>
+      <w:r>
+        <w:fldChar w:fldCharType="begin"/>
+      </w:r>
+      <w:r>
+        <w:instrText xml:space="preserve"> SEQ Ilustración \* ARABIC </w:instrText>
+      </w:r>
+      <w:r>
+        <w:fldChar w:fldCharType="separate"/>
+      </w:r>
+      <w:r>
+        <w:rPr>
+          <w:noProof/>
+        </w:rPr>
+        <w:t>5</w:t>
+      </w:r>
+      <w:r>
+        <w:rPr>
+          <w:noProof/>
+        </w:rPr>
+        <w:fldChar w:fldCharType="end"/>
+      </w:r>
+      <w:r>
+        <w:t xml:space="preserve"> Diagrama de estados Encargos</w:t>
+      </w:r>
+      <w:bookmarkEnd w:id="26"/>
+    </w:p>
+    <w:p>
+      <w:pPr>
+        <w:keepNext/>
+        <w:jc w:val="center"/>
+      </w:pPr>
+      <w:r>
+        <w:rPr>
+          <w:noProof/>
+        </w:rPr>
         <w:lastRenderedPageBreak/>
+        <w:drawing>
+          <wp:inline distT="0" distB="0" distL="0" distR="0" wp14:anchorId="0CB2B3BB" wp14:editId="3EA5B3AC">
+            <wp:extent cx="2829320" cy="7116168"/>
+            <wp:effectExtent l="0" t="0" r="9525" b="8890"/>
+            <wp:docPr id="1481265512" name="Imagen 1"/>
+            <wp:cNvGraphicFramePr>
+              <a:graphicFrameLocks xmlns:a="http://schemas.openxmlformats.org/drawingml/2006/main" noChangeAspect="1"/>
+            </wp:cNvGraphicFramePr>
+            <a:graphic xmlns:a="http://schemas.openxmlformats.org/drawingml/2006/main">
+              <a:graphicData uri="http://schemas.openxmlformats.org/drawingml/2006/picture">
+                <pic:pic xmlns:pic="http://schemas.openxmlformats.org/drawingml/2006/picture">
+                  <pic:nvPicPr>
+                    <pic:cNvPr id="1481265512" name=""/>
+                    <pic:cNvPicPr/>
+                  </pic:nvPicPr>
+                  <pic:blipFill>
+                    <a:blip r:embed="rId14"/>
+                    <a:stretch>
+                      <a:fillRect/>
+                    </a:stretch>
+                  </pic:blipFill>
+                  <pic:spPr>
+                    <a:xfrm>
+                      <a:off x="0" y="0"/>
+                      <a:ext cx="2829320" cy="7116168"/>
+                    </a:xfrm>
+                    <a:prstGeom prst="rect">
+                      <a:avLst/>
+                    </a:prstGeom>
+                  </pic:spPr>
+                </pic:pic>
+              </a:graphicData>
+            </a:graphic>
+          </wp:inline>
+        </w:drawing>
+      </w:r>
+    </w:p>
+    <w:p>
+      <w:pPr>
+        <w:pStyle w:val="Descripcin"/>
+        <w:jc w:val="center"/>
+      </w:pPr>
+      <w:bookmarkStart w:id="27" w:name="_Toc228392874"/>
+      <w:r>
         <w:t xml:space="preserve">Ilustración </w:t>
       </w:r>
       <w:r>
@@ -2780,6 +3674,9 @@
         <w:t>6</w:t>
       </w:r>
       <w:r>
+        <w:rPr>
+          <w:noProof/>
+        </w:rPr>
         <w:fldChar w:fldCharType="end"/>
       </w:r>
       <w:r>
@@ -2793,12 +3690,285 @@
       <w:r>
         <w:t xml:space="preserve"> de estados Login</w:t>
       </w:r>
-      <w:bookmarkEnd w:id="22"/>
+      <w:bookmarkEnd w:id="27"/>
     </w:p>
     <w:p/>
+    <w:p/>
+    <w:p>
+      <w:pPr>
+        <w:pStyle w:val="Ttulo1"/>
+      </w:pPr>
+      <w:bookmarkStart w:id="28" w:name="_Toc228392866"/>
+      <w:r>
+        <w:t>Diagrama de secuencia</w:t>
+      </w:r>
+      <w:bookmarkEnd w:id="28"/>
+      <w:r>
+        <w:t xml:space="preserve"> </w:t>
+      </w:r>
+    </w:p>
+    <w:p/>
+    <w:p>
+      <w:pPr>
+        <w:keepNext/>
+      </w:pPr>
+      <w:r>
+        <w:rPr>
+          <w:noProof/>
+        </w:rPr>
+        <w:lastRenderedPageBreak/>
+        <w:drawing>
+          <wp:inline distT="0" distB="0" distL="0" distR="0" wp14:anchorId="3338977F" wp14:editId="33B61F99">
+            <wp:extent cx="5400040" cy="2522220"/>
+            <wp:effectExtent l="0" t="0" r="0" b="0"/>
+            <wp:docPr id="630134312" name="Imagen 1"/>
+            <wp:cNvGraphicFramePr>
+              <a:graphicFrameLocks xmlns:a="http://schemas.openxmlformats.org/drawingml/2006/main" noChangeAspect="1"/>
+            </wp:cNvGraphicFramePr>
+            <a:graphic xmlns:a="http://schemas.openxmlformats.org/drawingml/2006/main">
+              <a:graphicData uri="http://schemas.openxmlformats.org/drawingml/2006/picture">
+                <pic:pic xmlns:pic="http://schemas.openxmlformats.org/drawingml/2006/picture">
+                  <pic:nvPicPr>
+                    <pic:cNvPr id="630134312" name=""/>
+                    <pic:cNvPicPr/>
+                  </pic:nvPicPr>
+                  <pic:blipFill>
+                    <a:blip r:embed="rId15"/>
+                    <a:stretch>
+                      <a:fillRect/>
+                    </a:stretch>
+                  </pic:blipFill>
+                  <pic:spPr>
+                    <a:xfrm>
+                      <a:off x="0" y="0"/>
+                      <a:ext cx="5400040" cy="2522220"/>
+                    </a:xfrm>
+                    <a:prstGeom prst="rect">
+                      <a:avLst/>
+                    </a:prstGeom>
+                  </pic:spPr>
+                </pic:pic>
+              </a:graphicData>
+            </a:graphic>
+          </wp:inline>
+        </w:drawing>
+      </w:r>
+    </w:p>
+    <w:p>
+      <w:pPr>
+        <w:pStyle w:val="Descripcin"/>
+        <w:jc w:val="center"/>
+      </w:pPr>
+      <w:r>
+        <w:t xml:space="preserve">Ilustración </w:t>
+      </w:r>
+      <w:r>
+        <w:fldChar w:fldCharType="begin"/>
+      </w:r>
+      <w:r>
+        <w:instrText xml:space="preserve"> SEQ Ilustración \* ARABIC </w:instrText>
+      </w:r>
+      <w:r>
+        <w:fldChar w:fldCharType="separate"/>
+      </w:r>
+      <w:r>
+        <w:rPr>
+          <w:noProof/>
+        </w:rPr>
+        <w:t>7</w:t>
+      </w:r>
+      <w:r>
+        <w:fldChar w:fldCharType="end"/>
+      </w:r>
+      <w:r>
+        <w:t xml:space="preserve"> Diagrama de secuencia</w:t>
+      </w:r>
+    </w:p>
+    <w:p/>
+    <w:p/>
+    <w:p>
+      <w:pPr>
+        <w:pStyle w:val="Ttulo1"/>
+      </w:pPr>
+      <w:bookmarkStart w:id="29" w:name="_Toc228392867"/>
+      <w:r>
+        <w:t>Diagrama de paquetes</w:t>
+      </w:r>
+      <w:bookmarkEnd w:id="29"/>
+    </w:p>
+    <w:p/>
+    <w:p/>
+    <w:p/>
+    <w:p/>
+    <w:p>
+      <w:pPr>
+        <w:keepNext/>
+      </w:pPr>
+      <w:r>
+        <w:rPr>
+          <w:noProof/>
+        </w:rPr>
+        <w:lastRenderedPageBreak/>
+        <w:drawing>
+          <wp:inline distT="0" distB="0" distL="0" distR="0" wp14:anchorId="591629D7" wp14:editId="424FFAB1">
+            <wp:extent cx="4286848" cy="7011378"/>
+            <wp:effectExtent l="0" t="0" r="0" b="0"/>
+            <wp:docPr id="2110488920" name="Imagen 1"/>
+            <wp:cNvGraphicFramePr>
+              <a:graphicFrameLocks xmlns:a="http://schemas.openxmlformats.org/drawingml/2006/main" noChangeAspect="1"/>
+            </wp:cNvGraphicFramePr>
+            <a:graphic xmlns:a="http://schemas.openxmlformats.org/drawingml/2006/main">
+              <a:graphicData uri="http://schemas.openxmlformats.org/drawingml/2006/picture">
+                <pic:pic xmlns:pic="http://schemas.openxmlformats.org/drawingml/2006/picture">
+                  <pic:nvPicPr>
+                    <pic:cNvPr id="2110488920" name=""/>
+                    <pic:cNvPicPr/>
+                  </pic:nvPicPr>
+                  <pic:blipFill>
+                    <a:blip r:embed="rId16"/>
+                    <a:stretch>
+                      <a:fillRect/>
+                    </a:stretch>
+                  </pic:blipFill>
+                  <pic:spPr>
+                    <a:xfrm>
+                      <a:off x="0" y="0"/>
+                      <a:ext cx="4286848" cy="7011378"/>
+                    </a:xfrm>
+                    <a:prstGeom prst="rect">
+                      <a:avLst/>
+                    </a:prstGeom>
+                  </pic:spPr>
+                </pic:pic>
+              </a:graphicData>
+            </a:graphic>
+          </wp:inline>
+        </w:drawing>
+      </w:r>
+    </w:p>
+    <w:p>
+      <w:pPr>
+        <w:pStyle w:val="Descripcin"/>
+        <w:jc w:val="center"/>
+      </w:pPr>
+      <w:r>
+        <w:t xml:space="preserve">Ilustración </w:t>
+      </w:r>
+      <w:r>
+        <w:fldChar w:fldCharType="begin"/>
+      </w:r>
+      <w:r>
+        <w:instrText xml:space="preserve"> SEQ Ilustración \* ARABIC </w:instrText>
+      </w:r>
+      <w:r>
+        <w:fldChar w:fldCharType="separate"/>
+      </w:r>
+      <w:r>
+        <w:rPr>
+          <w:noProof/>
+        </w:rPr>
+        <w:t>8</w:t>
+      </w:r>
+      <w:r>
+        <w:fldChar w:fldCharType="end"/>
+      </w:r>
+      <w:r>
+        <w:t xml:space="preserve"> Diagrama de paquetes</w:t>
+      </w:r>
+    </w:p>
+    <w:p/>
+    <w:p>
+      <w:pPr>
+        <w:pStyle w:val="Ttulo1"/>
+      </w:pPr>
+      <w:bookmarkStart w:id="30" w:name="_Toc228392868"/>
+      <w:r>
+        <w:t>Diagrama de objetos</w:t>
+      </w:r>
+      <w:bookmarkEnd w:id="30"/>
+    </w:p>
+    <w:p/>
+    <w:p/>
+    <w:p>
+      <w:pPr>
+        <w:keepNext/>
+        <w:jc w:val="center"/>
+      </w:pPr>
+      <w:r>
+        <w:rPr>
+          <w:noProof/>
+        </w:rPr>
+        <w:lastRenderedPageBreak/>
+        <w:drawing>
+          <wp:inline distT="0" distB="0" distL="0" distR="0" wp14:anchorId="4F6A0E6C" wp14:editId="32B82CB6">
+            <wp:extent cx="4420217" cy="7001852"/>
+            <wp:effectExtent l="0" t="0" r="0" b="8890"/>
+            <wp:docPr id="431272947" name="Imagen 1"/>
+            <wp:cNvGraphicFramePr>
+              <a:graphicFrameLocks xmlns:a="http://schemas.openxmlformats.org/drawingml/2006/main" noChangeAspect="1"/>
+            </wp:cNvGraphicFramePr>
+            <a:graphic xmlns:a="http://schemas.openxmlformats.org/drawingml/2006/main">
+              <a:graphicData uri="http://schemas.openxmlformats.org/drawingml/2006/picture">
+                <pic:pic xmlns:pic="http://schemas.openxmlformats.org/drawingml/2006/picture">
+                  <pic:nvPicPr>
+                    <pic:cNvPr id="431272947" name=""/>
+                    <pic:cNvPicPr/>
+                  </pic:nvPicPr>
+                  <pic:blipFill>
+                    <a:blip r:embed="rId17"/>
+                    <a:stretch>
+                      <a:fillRect/>
+                    </a:stretch>
+                  </pic:blipFill>
+                  <pic:spPr>
+                    <a:xfrm>
+                      <a:off x="0" y="0"/>
+                      <a:ext cx="4420217" cy="7001852"/>
+                    </a:xfrm>
+                    <a:prstGeom prst="rect">
+                      <a:avLst/>
+                    </a:prstGeom>
+                  </pic:spPr>
+                </pic:pic>
+              </a:graphicData>
+            </a:graphic>
+          </wp:inline>
+        </w:drawing>
+      </w:r>
+    </w:p>
+    <w:p>
+      <w:pPr>
+        <w:pStyle w:val="Descripcin"/>
+        <w:jc w:val="center"/>
+      </w:pPr>
+      <w:r>
+        <w:t xml:space="preserve">Ilustración </w:t>
+      </w:r>
+      <w:r>
+        <w:fldChar w:fldCharType="begin"/>
+      </w:r>
+      <w:r>
+        <w:instrText xml:space="preserve"> SEQ Ilustración \* ARABIC </w:instrText>
+      </w:r>
+      <w:r>
+        <w:fldChar w:fldCharType="separate"/>
+      </w:r>
+      <w:r>
+        <w:rPr>
+          <w:noProof/>
+        </w:rPr>
+        <w:t>9</w:t>
+      </w:r>
+      <w:r>
+        <w:fldChar w:fldCharType="end"/>
+      </w:r>
+      <w:r>
+        <w:t xml:space="preserve"> Diagrama de objetos</w:t>
+      </w:r>
+    </w:p>
     <w:sectPr>
-      <w:headerReference w:type="default" r:id="rId14"/>
-      <w:footerReference w:type="default" r:id="rId15"/>
+      <w:headerReference w:type="default" r:id="rId18"/>
+      <w:footerReference w:type="default" r:id="rId19"/>
       <w:pgSz w:w="11906" w:h="16838"/>
       <w:pgMar w:top="1417" w:right="1701" w:bottom="1417" w:left="1701" w:header="708" w:footer="708" w:gutter="0"/>
       <w:cols w:space="708"/>
@@ -2929,6 +4099,394 @@
     </w:r>
   </w:p>
 </w:hdr>
+</file>
+
+<file path=word/numbering.xml><?xml version="1.0" encoding="utf-8"?>
+<w:numbering xmlns:wpc="http://schemas.microsoft.com/office/word/2010/wordprocessingCanvas" xmlns:cx="http://schemas.microsoft.com/office/drawing/2014/chartex" xmlns:cx1="http://schemas.microsoft.com/office/drawing/2015/9/8/chartex" xmlns:cx2="http://schemas.microsoft.com/office/drawing/2015/10/21/chartex" xmlns:cx3="http://schemas.microsoft.com/office/drawing/2016/5/9/chartex" xmlns:cx4="http://schemas.microsoft.com/office/drawing/2016/5/10/chartex" xmlns:cx5="http://schemas.microsoft.com/office/drawing/2016/5/11/chartex" xmlns:cx6="http://schemas.microsoft.com/office/drawing/2016/5/12/chartex" xmlns:cx7="http://schemas.microsoft.com/office/drawing/2016/5/13/chartex" xmlns:cx8="http://schemas.microsoft.com/office/drawing/2016/5/14/chartex" xmlns:mc="http://schemas.openxmlformats.org/markup-compatibility/2006" xmlns:aink="http://schemas.microsoft.com/office/drawing/2016/ink" xmlns:am3d="http://schemas.microsoft.com/office/drawing/2017/model3d" xmlns:o="urn:schemas-microsoft-com:office:office" xmlns:oel="http://schemas.microsoft.com/office/2019/extlst" xmlns:r="http://schemas.openxmlformats.org/officeDocument/2006/relationships" xmlns:m="http://schemas.openxmlformats.org/officeDocument/2006/math" xmlns:v="urn:schemas-microsoft-com:vml" xmlns:wp14="http://schemas.microsoft.com/office/word/2010/wordprocessingDrawing" xmlns:wp="http://schemas.openxmlformats.org/drawingml/2006/wordprocessingDrawing" xmlns:w10="urn:schemas-microsoft-com:office:word" xmlns:w="http://schemas.openxmlformats.org/wordprocessingml/2006/main" xmlns:w14="http://schemas.microsoft.com/office/word/2010/wordml" xmlns:w15="http://schemas.microsoft.com/office/word/2012/wordml" xmlns:w16cex="http://schemas.microsoft.com/office/word/2018/wordml/cex" xmlns:w16cid="http://schemas.microsoft.com/office/word/2016/wordml/cid" xmlns:w16="http://schemas.microsoft.com/office/word/2018/wordml" xmlns:w16du="http://schemas.microsoft.com/office/word/2023/wordml/word16du" xmlns:w16sdtdh="http://schemas.microsoft.com/office/word/2020/wordml/sdtdatahash" xmlns:w16sdtfl="http://schemas.microsoft.com/office/word/2024/wordml/sdtformatlock" xmlns:w16se="http://schemas.microsoft.com/office/word/2015/wordml/symex" xmlns:wpg="http://schemas.microsoft.com/office/word/2010/wordprocessingGroup" xmlns:wpi="http://schemas.microsoft.com/office/word/2010/wordprocessingInk" xmlns:wne="http://schemas.microsoft.com/office/word/2006/wordml" xmlns:wps="http://schemas.microsoft.com/office/word/2010/wordprocessingShape" mc:Ignorable="w14 w15 w16se w16cid w16 w16cex w16sdtdh w16sdtfl w16du wp14">
+  <w:abstractNum w:abstractNumId="0" w15:restartNumberingAfterBreak="0">
+    <w:nsid w:val="2FE51D9B"/>
+    <w:multiLevelType w:val="hybridMultilevel"/>
+    <w:tmpl w:val="1A520C68"/>
+    <w:lvl w:ilvl="0" w:tplc="0C0A0001">
+      <w:start w:val="1"/>
+      <w:numFmt w:val="bullet"/>
+      <w:lvlText w:val=""/>
+      <w:lvlJc w:val="left"/>
+      <w:pPr>
+        <w:ind w:left="720" w:hanging="360"/>
+      </w:pPr>
+      <w:rPr>
+        <w:rFonts w:ascii="Symbol" w:hAnsi="Symbol" w:hint="default"/>
+      </w:rPr>
+    </w:lvl>
+    <w:lvl w:ilvl="1" w:tplc="0C0A0003" w:tentative="1">
+      <w:start w:val="1"/>
+      <w:numFmt w:val="bullet"/>
+      <w:lvlText w:val="o"/>
+      <w:lvlJc w:val="left"/>
+      <w:pPr>
+        <w:ind w:left="1440" w:hanging="360"/>
+      </w:pPr>
+      <w:rPr>
+        <w:rFonts w:ascii="Courier New" w:hAnsi="Courier New" w:cs="Courier New" w:hint="default"/>
+      </w:rPr>
+    </w:lvl>
+    <w:lvl w:ilvl="2" w:tplc="0C0A0005" w:tentative="1">
+      <w:start w:val="1"/>
+      <w:numFmt w:val="bullet"/>
+      <w:lvlText w:val=""/>
+      <w:lvlJc w:val="left"/>
+      <w:pPr>
+        <w:ind w:left="2160" w:hanging="360"/>
+      </w:pPr>
+      <w:rPr>
+        <w:rFonts w:ascii="Wingdings" w:hAnsi="Wingdings" w:hint="default"/>
+      </w:rPr>
+    </w:lvl>
+    <w:lvl w:ilvl="3" w:tplc="0C0A0001" w:tentative="1">
+      <w:start w:val="1"/>
+      <w:numFmt w:val="bullet"/>
+      <w:lvlText w:val=""/>
+      <w:lvlJc w:val="left"/>
+      <w:pPr>
+        <w:ind w:left="2880" w:hanging="360"/>
+      </w:pPr>
+      <w:rPr>
+        <w:rFonts w:ascii="Symbol" w:hAnsi="Symbol" w:hint="default"/>
+      </w:rPr>
+    </w:lvl>
+    <w:lvl w:ilvl="4" w:tplc="0C0A0003" w:tentative="1">
+      <w:start w:val="1"/>
+      <w:numFmt w:val="bullet"/>
+      <w:lvlText w:val="o"/>
+      <w:lvlJc w:val="left"/>
+      <w:pPr>
+        <w:ind w:left="3600" w:hanging="360"/>
+      </w:pPr>
+      <w:rPr>
+        <w:rFonts w:ascii="Courier New" w:hAnsi="Courier New" w:cs="Courier New" w:hint="default"/>
+      </w:rPr>
+    </w:lvl>
+    <w:lvl w:ilvl="5" w:tplc="0C0A0005" w:tentative="1">
+      <w:start w:val="1"/>
+      <w:numFmt w:val="bullet"/>
+      <w:lvlText w:val=""/>
+      <w:lvlJc w:val="left"/>
+      <w:pPr>
+        <w:ind w:left="4320" w:hanging="360"/>
+      </w:pPr>
+      <w:rPr>
+        <w:rFonts w:ascii="Wingdings" w:hAnsi="Wingdings" w:hint="default"/>
+      </w:rPr>
+    </w:lvl>
+    <w:lvl w:ilvl="6" w:tplc="0C0A0001" w:tentative="1">
+      <w:start w:val="1"/>
+      <w:numFmt w:val="bullet"/>
+      <w:lvlText w:val=""/>
+      <w:lvlJc w:val="left"/>
+      <w:pPr>
+        <w:ind w:left="5040" w:hanging="360"/>
+      </w:pPr>
+      <w:rPr>
+        <w:rFonts w:ascii="Symbol" w:hAnsi="Symbol" w:hint="default"/>
+      </w:rPr>
+    </w:lvl>
+    <w:lvl w:ilvl="7" w:tplc="0C0A0003" w:tentative="1">
+      <w:start w:val="1"/>
+      <w:numFmt w:val="bullet"/>
+      <w:lvlText w:val="o"/>
+      <w:lvlJc w:val="left"/>
+      <w:pPr>
+        <w:ind w:left="5760" w:hanging="360"/>
+      </w:pPr>
+      <w:rPr>
+        <w:rFonts w:ascii="Courier New" w:hAnsi="Courier New" w:cs="Courier New" w:hint="default"/>
+      </w:rPr>
+    </w:lvl>
+    <w:lvl w:ilvl="8" w:tplc="0C0A0005" w:tentative="1">
+      <w:start w:val="1"/>
+      <w:numFmt w:val="bullet"/>
+      <w:lvlText w:val=""/>
+      <w:lvlJc w:val="left"/>
+      <w:pPr>
+        <w:ind w:left="6480" w:hanging="360"/>
+      </w:pPr>
+      <w:rPr>
+        <w:rFonts w:ascii="Wingdings" w:hAnsi="Wingdings" w:hint="default"/>
+      </w:rPr>
+    </w:lvl>
+  </w:abstractNum>
+  <w:abstractNum w:abstractNumId="1" w15:restartNumberingAfterBreak="0">
+    <w:nsid w:val="4D7E21AC"/>
+    <w:multiLevelType w:val="hybridMultilevel"/>
+    <w:tmpl w:val="D28A968C"/>
+    <w:lvl w:ilvl="0" w:tplc="A3D0F662">
+      <w:numFmt w:val="bullet"/>
+      <w:lvlText w:val=""/>
+      <w:lvlJc w:val="left"/>
+      <w:pPr>
+        <w:ind w:left="720" w:hanging="360"/>
+      </w:pPr>
+      <w:rPr>
+        <w:rFonts w:ascii="Symbol" w:eastAsiaTheme="minorHAnsi" w:hAnsi="Symbol" w:cstheme="minorBidi" w:hint="default"/>
+      </w:rPr>
+    </w:lvl>
+    <w:lvl w:ilvl="1" w:tplc="0C0A0003" w:tentative="1">
+      <w:start w:val="1"/>
+      <w:numFmt w:val="bullet"/>
+      <w:lvlText w:val="o"/>
+      <w:lvlJc w:val="left"/>
+      <w:pPr>
+        <w:ind w:left="1440" w:hanging="360"/>
+      </w:pPr>
+      <w:rPr>
+        <w:rFonts w:ascii="Courier New" w:hAnsi="Courier New" w:cs="Courier New" w:hint="default"/>
+      </w:rPr>
+    </w:lvl>
+    <w:lvl w:ilvl="2" w:tplc="0C0A0005" w:tentative="1">
+      <w:start w:val="1"/>
+      <w:numFmt w:val="bullet"/>
+      <w:lvlText w:val=""/>
+      <w:lvlJc w:val="left"/>
+      <w:pPr>
+        <w:ind w:left="2160" w:hanging="360"/>
+      </w:pPr>
+      <w:rPr>
+        <w:rFonts w:ascii="Wingdings" w:hAnsi="Wingdings" w:hint="default"/>
+      </w:rPr>
+    </w:lvl>
+    <w:lvl w:ilvl="3" w:tplc="0C0A0001" w:tentative="1">
+      <w:start w:val="1"/>
+      <w:numFmt w:val="bullet"/>
+      <w:lvlText w:val=""/>
+      <w:lvlJc w:val="left"/>
+      <w:pPr>
+        <w:ind w:left="2880" w:hanging="360"/>
+      </w:pPr>
+      <w:rPr>
+        <w:rFonts w:ascii="Symbol" w:hAnsi="Symbol" w:hint="default"/>
+      </w:rPr>
+    </w:lvl>
+    <w:lvl w:ilvl="4" w:tplc="0C0A0003" w:tentative="1">
+      <w:start w:val="1"/>
+      <w:numFmt w:val="bullet"/>
+      <w:lvlText w:val="o"/>
+      <w:lvlJc w:val="left"/>
+      <w:pPr>
+        <w:ind w:left="3600" w:hanging="360"/>
+      </w:pPr>
+      <w:rPr>
+        <w:rFonts w:ascii="Courier New" w:hAnsi="Courier New" w:cs="Courier New" w:hint="default"/>
+      </w:rPr>
+    </w:lvl>
+    <w:lvl w:ilvl="5" w:tplc="0C0A0005" w:tentative="1">
+      <w:start w:val="1"/>
+      <w:numFmt w:val="bullet"/>
+      <w:lvlText w:val=""/>
+      <w:lvlJc w:val="left"/>
+      <w:pPr>
+        <w:ind w:left="4320" w:hanging="360"/>
+      </w:pPr>
+      <w:rPr>
+        <w:rFonts w:ascii="Wingdings" w:hAnsi="Wingdings" w:hint="default"/>
+      </w:rPr>
+    </w:lvl>
+    <w:lvl w:ilvl="6" w:tplc="0C0A0001" w:tentative="1">
+      <w:start w:val="1"/>
+      <w:numFmt w:val="bullet"/>
+      <w:lvlText w:val=""/>
+      <w:lvlJc w:val="left"/>
+      <w:pPr>
+        <w:ind w:left="5040" w:hanging="360"/>
+      </w:pPr>
+      <w:rPr>
+        <w:rFonts w:ascii="Symbol" w:hAnsi="Symbol" w:hint="default"/>
+      </w:rPr>
+    </w:lvl>
+    <w:lvl w:ilvl="7" w:tplc="0C0A0003" w:tentative="1">
+      <w:start w:val="1"/>
+      <w:numFmt w:val="bullet"/>
+      <w:lvlText w:val="o"/>
+      <w:lvlJc w:val="left"/>
+      <w:pPr>
+        <w:ind w:left="5760" w:hanging="360"/>
+      </w:pPr>
+      <w:rPr>
+        <w:rFonts w:ascii="Courier New" w:hAnsi="Courier New" w:cs="Courier New" w:hint="default"/>
+      </w:rPr>
+    </w:lvl>
+    <w:lvl w:ilvl="8" w:tplc="0C0A0005" w:tentative="1">
+      <w:start w:val="1"/>
+      <w:numFmt w:val="bullet"/>
+      <w:lvlText w:val=""/>
+      <w:lvlJc w:val="left"/>
+      <w:pPr>
+        <w:ind w:left="6480" w:hanging="360"/>
+      </w:pPr>
+      <w:rPr>
+        <w:rFonts w:ascii="Wingdings" w:hAnsi="Wingdings" w:hint="default"/>
+      </w:rPr>
+    </w:lvl>
+  </w:abstractNum>
+  <w:abstractNum w:abstractNumId="2" w15:restartNumberingAfterBreak="0">
+    <w:nsid w:val="615125D6"/>
+    <w:multiLevelType w:val="multilevel"/>
+    <w:tmpl w:val="609A5712"/>
+    <w:lvl w:ilvl="0">
+      <w:start w:val="1"/>
+      <w:numFmt w:val="bullet"/>
+      <w:lvlText w:val=""/>
+      <w:lvlJc w:val="left"/>
+      <w:pPr>
+        <w:tabs>
+          <w:tab w:val="num" w:pos="720"/>
+        </w:tabs>
+        <w:ind w:left="720" w:hanging="360"/>
+      </w:pPr>
+      <w:rPr>
+        <w:rFonts w:ascii="Symbol" w:hAnsi="Symbol" w:hint="default"/>
+        <w:sz w:val="20"/>
+      </w:rPr>
+    </w:lvl>
+    <w:lvl w:ilvl="1" w:tentative="1">
+      <w:start w:val="1"/>
+      <w:numFmt w:val="bullet"/>
+      <w:lvlText w:val="o"/>
+      <w:lvlJc w:val="left"/>
+      <w:pPr>
+        <w:tabs>
+          <w:tab w:val="num" w:pos="1440"/>
+        </w:tabs>
+        <w:ind w:left="1440" w:hanging="360"/>
+      </w:pPr>
+      <w:rPr>
+        <w:rFonts w:ascii="Courier New" w:hAnsi="Courier New" w:hint="default"/>
+        <w:sz w:val="20"/>
+      </w:rPr>
+    </w:lvl>
+    <w:lvl w:ilvl="2" w:tentative="1">
+      <w:start w:val="1"/>
+      <w:numFmt w:val="bullet"/>
+      <w:lvlText w:val=""/>
+      <w:lvlJc w:val="left"/>
+      <w:pPr>
+        <w:tabs>
+          <w:tab w:val="num" w:pos="2160"/>
+        </w:tabs>
+        <w:ind w:left="2160" w:hanging="360"/>
+      </w:pPr>
+      <w:rPr>
+        <w:rFonts w:ascii="Wingdings" w:hAnsi="Wingdings" w:hint="default"/>
+        <w:sz w:val="20"/>
+      </w:rPr>
+    </w:lvl>
+    <w:lvl w:ilvl="3" w:tentative="1">
+      <w:start w:val="1"/>
+      <w:numFmt w:val="bullet"/>
+      <w:lvlText w:val=""/>
+      <w:lvlJc w:val="left"/>
+      <w:pPr>
+        <w:tabs>
+          <w:tab w:val="num" w:pos="2880"/>
+        </w:tabs>
+        <w:ind w:left="2880" w:hanging="360"/>
+      </w:pPr>
+      <w:rPr>
+        <w:rFonts w:ascii="Wingdings" w:hAnsi="Wingdings" w:hint="default"/>
+        <w:sz w:val="20"/>
+      </w:rPr>
+    </w:lvl>
+    <w:lvl w:ilvl="4" w:tentative="1">
+      <w:start w:val="1"/>
+      <w:numFmt w:val="bullet"/>
+      <w:lvlText w:val=""/>
+      <w:lvlJc w:val="left"/>
+      <w:pPr>
+        <w:tabs>
+          <w:tab w:val="num" w:pos="3600"/>
+        </w:tabs>
+        <w:ind w:left="3600" w:hanging="360"/>
+      </w:pPr>
+      <w:rPr>
+        <w:rFonts w:ascii="Wingdings" w:hAnsi="Wingdings" w:hint="default"/>
+        <w:sz w:val="20"/>
+      </w:rPr>
+    </w:lvl>
+    <w:lvl w:ilvl="5" w:tentative="1">
+      <w:start w:val="1"/>
+      <w:numFmt w:val="bullet"/>
+      <w:lvlText w:val=""/>
+      <w:lvlJc w:val="left"/>
+      <w:pPr>
+        <w:tabs>
+          <w:tab w:val="num" w:pos="4320"/>
+        </w:tabs>
+        <w:ind w:left="4320" w:hanging="360"/>
+      </w:pPr>
+      <w:rPr>
+        <w:rFonts w:ascii="Wingdings" w:hAnsi="Wingdings" w:hint="default"/>
+        <w:sz w:val="20"/>
+      </w:rPr>
+    </w:lvl>
+    <w:lvl w:ilvl="6" w:tentative="1">
+      <w:start w:val="1"/>
+      <w:numFmt w:val="bullet"/>
+      <w:lvlText w:val=""/>
+      <w:lvlJc w:val="left"/>
+      <w:pPr>
+        <w:tabs>
+          <w:tab w:val="num" w:pos="5040"/>
+        </w:tabs>
+        <w:ind w:left="5040" w:hanging="360"/>
+      </w:pPr>
+      <w:rPr>
+        <w:rFonts w:ascii="Wingdings" w:hAnsi="Wingdings" w:hint="default"/>
+        <w:sz w:val="20"/>
+      </w:rPr>
+    </w:lvl>
+    <w:lvl w:ilvl="7" w:tentative="1">
+      <w:start w:val="1"/>
+      <w:numFmt w:val="bullet"/>
+      <w:lvlText w:val=""/>
+      <w:lvlJc w:val="left"/>
+      <w:pPr>
+        <w:tabs>
+          <w:tab w:val="num" w:pos="5760"/>
+        </w:tabs>
+        <w:ind w:left="5760" w:hanging="360"/>
+      </w:pPr>
+      <w:rPr>
+        <w:rFonts w:ascii="Wingdings" w:hAnsi="Wingdings" w:hint="default"/>
+        <w:sz w:val="20"/>
+      </w:rPr>
+    </w:lvl>
+    <w:lvl w:ilvl="8" w:tentative="1">
+      <w:start w:val="1"/>
+      <w:numFmt w:val="bullet"/>
+      <w:lvlText w:val=""/>
+      <w:lvlJc w:val="left"/>
+      <w:pPr>
+        <w:tabs>
+          <w:tab w:val="num" w:pos="6480"/>
+        </w:tabs>
+        <w:ind w:left="6480" w:hanging="360"/>
+      </w:pPr>
+      <w:rPr>
+        <w:rFonts w:ascii="Wingdings" w:hAnsi="Wingdings" w:hint="default"/>
+        <w:sz w:val="20"/>
+      </w:rPr>
+    </w:lvl>
+  </w:abstractNum>
+  <w:num w:numId="1" w16cid:durableId="1721514869">
+    <w:abstractNumId w:val="2"/>
+  </w:num>
+  <w:num w:numId="2" w16cid:durableId="625965498">
+    <w:abstractNumId w:val="0"/>
+  </w:num>
+  <w:num w:numId="3" w16cid:durableId="31199027">
+    <w:abstractNumId w:val="1"/>
+  </w:num>
+</w:numbering>
 </file>
 
 <file path=word/styles.xml><?xml version="1.0" encoding="utf-8"?>
@@ -3532,7 +5090,6 @@
   <w:style w:type="character" w:default="1" w:styleId="Fuentedeprrafopredeter">
     <w:name w:val="Default Paragraph Font"/>
     <w:uiPriority w:val="1"/>
-    <w:semiHidden/>
     <w:unhideWhenUsed/>
   </w:style>
   <w:style w:type="table" w:default="1" w:styleId="Tablanormal">

</xml_diff>